<commit_message>
Rename meeting form fields; update docx template
Change form input name attributes from meeting_day/meeting_month/meeting_year to meet_day/meet_month/meet_year in the academic admin document form to match updated field naming (likely for backend binding). Also include an updated docx template (doc_7.docx) binary change.
</commit_message>
<xml_diff>
--- a/shopping-cart-spring-boot-main/src/main/resources/templates/docx/doc_7.docx
+++ b/shopping-cart-spring-boot-main/src/main/resources/templates/docx/doc_7.docx
@@ -94,6 +94,46 @@
           <w:cs/>
         </w:rPr>
         <w:tab/>
+        <w:t>คณะอนุกรรมการเพื่อประเมินผลการสอน</w:t>
+      </w:r>
+      <w:r>
+        <w:rPr>
+          <w:rFonts w:ascii="TH SarabunIT๙" w:hAnsi="TH SarabunIT๙" w:cs="TH SarabunIT๙" w:hint="cs"/>
+          <w:color w:val="000000" w:themeColor="text1"/>
+          <w:sz w:val="32"/>
+          <w:szCs w:val="32"/>
+          <w:cs/>
+        </w:rPr>
+        <w:t xml:space="preserve"> </w:t>
+      </w:r>
+      <w:r>
+        <w:rPr>
+          <w:rFonts w:ascii="TH SarabunIT๙" w:hAnsi="TH SarabunIT๙" w:cs="TH SarabunIT๙"/>
+          <w:color w:val="000000" w:themeColor="text1"/>
+          <w:sz w:val="32"/>
+          <w:szCs w:val="32"/>
+          <w:cs/>
+        </w:rPr>
+        <w:t>ในการประชุมครั้งที่</w:t>
+      </w:r>
+      <w:r>
+        <w:rPr>
+          <w:rFonts w:ascii="TH SarabunIT๙" w:hAnsi="TH SarabunIT๙" w:cs="TH SarabunIT๙"/>
+          <w:color w:val="000000" w:themeColor="text1"/>
+          <w:sz w:val="32"/>
+          <w:szCs w:val="32"/>
+        </w:rPr>
+        <w:t xml:space="preserve"> </w:t>
+      </w:r>
+      <w:r>
+        <w:rPr>
+          <w:rFonts w:ascii="TH SarabunIT๙" w:hAnsi="TH SarabunIT๙" w:cs="TH SarabunIT๙"/>
+          <w:color w:val="000000" w:themeColor="text1"/>
+          <w:sz w:val="32"/>
+          <w:szCs w:val="32"/>
+          <w:lang w:bidi="th-TH"/>
+        </w:rPr>
+        <w:t>{{</w:t>
       </w:r>
       <w:proofErr w:type="spellStart"/>
       <w:r>
@@ -102,21 +142,102 @@
           <w:color w:val="000000" w:themeColor="text1"/>
           <w:sz w:val="32"/>
           <w:szCs w:val="32"/>
-          <w:cs/>
-        </w:rPr>
-        <w:t>คณะอนุกรรมการเพื่อประเมินผลการสอน</w:t>
+          <w:lang w:bidi="th-TH"/>
+        </w:rPr>
+        <w:t>meeting_no</w:t>
       </w:r>
       <w:proofErr w:type="spellEnd"/>
       <w:r>
         <w:rPr>
+          <w:rFonts w:ascii="TH SarabunIT๙" w:hAnsi="TH SarabunIT๙" w:cs="TH SarabunIT๙"/>
+          <w:color w:val="000000" w:themeColor="text1"/>
+          <w:sz w:val="32"/>
+          <w:szCs w:val="32"/>
+          <w:lang w:bidi="th-TH"/>
+        </w:rPr>
+        <w:t>}}</w:t>
+      </w:r>
+      <w:r>
+        <w:rPr>
+          <w:rFonts w:ascii="TH SarabunIT๙" w:hAnsi="TH SarabunIT๙" w:cs="TH SarabunIT๙"/>
+          <w:color w:val="000000" w:themeColor="text1"/>
+          <w:sz w:val="32"/>
+          <w:szCs w:val="32"/>
+        </w:rPr>
+        <w:t xml:space="preserve"> </w:t>
+      </w:r>
+      <w:r>
+        <w:rPr>
+          <w:rFonts w:ascii="TH SarabunIT๙" w:hAnsi="TH SarabunIT๙" w:cs="TH SarabunIT๙"/>
+          <w:color w:val="000000" w:themeColor="text1"/>
+          <w:sz w:val="32"/>
+          <w:szCs w:val="32"/>
+          <w:cs/>
+        </w:rPr>
+        <w:t>เมื่อวันที่</w:t>
+      </w:r>
+      <w:r>
+        <w:rPr>
+          <w:rFonts w:ascii="TH SarabunIT๙" w:hAnsi="TH SarabunIT๙" w:cs="TH SarabunIT๙"/>
+          <w:color w:val="000000" w:themeColor="text1"/>
+          <w:sz w:val="32"/>
+          <w:szCs w:val="32"/>
+        </w:rPr>
+        <w:t xml:space="preserve"> </w:t>
+      </w:r>
+      <w:r>
+        <w:rPr>
+          <w:rFonts w:ascii="TH SarabunIT๙" w:hAnsi="TH SarabunIT๙" w:cs="TH SarabunIT๙"/>
+          <w:color w:val="000000" w:themeColor="text1"/>
+          <w:sz w:val="32"/>
+          <w:szCs w:val="32"/>
+          <w:lang w:bidi="th-TH"/>
+        </w:rPr>
+        <w:t>{{</w:t>
+      </w:r>
+      <w:proofErr w:type="spellStart"/>
+      <w:r>
+        <w:rPr>
+          <w:rFonts w:ascii="TH SarabunIT๙" w:hAnsi="TH SarabunIT๙" w:cs="TH SarabunIT๙"/>
+          <w:color w:val="000000" w:themeColor="text1"/>
+          <w:sz w:val="32"/>
+          <w:szCs w:val="32"/>
+          <w:lang w:bidi="th-TH"/>
+        </w:rPr>
+        <w:t>meet_day</w:t>
+      </w:r>
+      <w:proofErr w:type="spellEnd"/>
+      <w:r>
+        <w:rPr>
+          <w:rFonts w:ascii="TH SarabunIT๙" w:hAnsi="TH SarabunIT๙" w:cs="TH SarabunIT๙"/>
+          <w:color w:val="000000" w:themeColor="text1"/>
+          <w:sz w:val="32"/>
+          <w:szCs w:val="32"/>
+          <w:lang w:bidi="th-TH"/>
+        </w:rPr>
+        <w:t>}}</w:t>
+      </w:r>
+      <w:r>
+        <w:rPr>
           <w:rFonts w:ascii="TH SarabunIT๙" w:hAnsi="TH SarabunIT๙" w:cs="TH SarabunIT๙" w:hint="cs"/>
           <w:color w:val="000000" w:themeColor="text1"/>
           <w:sz w:val="32"/>
           <w:szCs w:val="32"/>
           <w:cs/>
+          <w:lang w:bidi="th-TH"/>
         </w:rPr>
         <w:t xml:space="preserve"> </w:t>
       </w:r>
+      <w:r>
+        <w:rPr>
+          <w:rFonts w:ascii="TH SarabunIT๙" w:hAnsi="TH SarabunIT๙" w:cs="TH SarabunIT๙"/>
+          <w:color w:val="000000" w:themeColor="text1"/>
+          <w:sz w:val="32"/>
+          <w:szCs w:val="32"/>
+          <w:lang w:bidi="th-TH"/>
+        </w:rPr>
+        <w:t>{{</w:t>
+      </w:r>
       <w:proofErr w:type="spellStart"/>
       <w:r>
         <w:rPr>
@@ -124,9 +245,9 @@
           <w:color w:val="000000" w:themeColor="text1"/>
           <w:sz w:val="32"/>
           <w:szCs w:val="32"/>
-          <w:cs/>
-        </w:rPr>
-        <w:t>ในการประชุมครั้งที่</w:t>
+          <w:lang w:bidi="th-TH"/>
+        </w:rPr>
+        <w:t>meet_month</w:t>
       </w:r>
       <w:proofErr w:type="spellEnd"/>
       <w:r>
@@ -135,49 +256,242 @@
           <w:color w:val="000000" w:themeColor="text1"/>
           <w:sz w:val="32"/>
           <w:szCs w:val="32"/>
+          <w:lang w:bidi="th-TH"/>
+        </w:rPr>
+        <w:t xml:space="preserve">}} </w:t>
+      </w:r>
+      <w:r>
+        <w:rPr>
+          <w:rFonts w:ascii="TH SarabunIT๙" w:hAnsi="TH SarabunIT๙" w:cs="TH SarabunIT๙"/>
+          <w:color w:val="000000" w:themeColor="text1"/>
+          <w:sz w:val="32"/>
+          <w:szCs w:val="32"/>
+          <w:lang w:bidi="th-TH"/>
+        </w:rPr>
+        <w:t>{{</w:t>
+      </w:r>
+      <w:proofErr w:type="spellStart"/>
+      <w:r>
+        <w:rPr>
+          <w:rFonts w:ascii="TH SarabunIT๙" w:hAnsi="TH SarabunIT๙" w:cs="TH SarabunIT๙"/>
+          <w:color w:val="000000" w:themeColor="text1"/>
+          <w:sz w:val="32"/>
+          <w:szCs w:val="32"/>
+          <w:lang w:bidi="th-TH"/>
+        </w:rPr>
+        <w:t>meet_year</w:t>
+      </w:r>
+      <w:proofErr w:type="spellEnd"/>
+      <w:r>
+        <w:rPr>
+          <w:rFonts w:ascii="TH SarabunIT๙" w:hAnsi="TH SarabunIT๙" w:cs="TH SarabunIT๙"/>
+          <w:color w:val="000000" w:themeColor="text1"/>
+          <w:sz w:val="32"/>
+          <w:szCs w:val="32"/>
+          <w:lang w:bidi="th-TH"/>
+        </w:rPr>
+        <w:t>}}</w:t>
+      </w:r>
+      <w:r>
+        <w:rPr>
+          <w:rFonts w:ascii="TH SarabunIT๙" w:hAnsi="TH SarabunIT๙" w:cs="TH SarabunIT๙" w:hint="cs"/>
+          <w:color w:val="000000" w:themeColor="text1"/>
+          <w:sz w:val="32"/>
+          <w:szCs w:val="32"/>
+          <w:cs/>
+          <w:lang w:bidi="th-TH"/>
+        </w:rPr>
+        <w:t xml:space="preserve">  </w:t>
+      </w:r>
+      <w:r>
+        <w:rPr>
+          <w:rFonts w:ascii="TH SarabunIT๙" w:hAnsi="TH SarabunIT๙" w:cs="TH SarabunIT๙"/>
+          <w:color w:val="000000" w:themeColor="text1"/>
+          <w:sz w:val="32"/>
+          <w:szCs w:val="32"/>
+          <w:cs/>
+        </w:rPr>
+        <w:t>ซึ่งได้รับมอบอำนาจจากคณะกรรมการพิจารณาตำแหน่งทางวิชาการ</w:t>
+      </w:r>
+      <w:r>
+        <w:rPr>
+          <w:rFonts w:ascii="TH SarabunIT๙" w:hAnsi="TH SarabunIT๙" w:cs="TH SarabunIT๙" w:hint="cs"/>
+          <w:color w:val="000000" w:themeColor="text1"/>
+          <w:sz w:val="32"/>
+          <w:szCs w:val="32"/>
+          <w:cs/>
+          <w:lang w:bidi="th-TH"/>
+        </w:rPr>
+        <w:t>มหาวิทยาลัยขอนแก่น</w:t>
+      </w:r>
+      <w:r>
+        <w:rPr>
+          <w:rFonts w:ascii="TH SarabunIT๙" w:hAnsi="TH SarabunIT๙" w:cs="TH SarabunIT๙"/>
+          <w:color w:val="000000" w:themeColor="text1"/>
+          <w:sz w:val="32"/>
+          <w:szCs w:val="32"/>
+          <w:cs/>
+        </w:rPr>
+        <w:t xml:space="preserve"> ได้ประเมินผลการสอนรหัสวิชา</w:t>
+      </w:r>
+      <w:r>
+        <w:rPr>
+          <w:rFonts w:ascii="TH Sarabun New" w:hAnsi="TH Sarabun New" w:cs="TH Sarabun New"/>
+          <w:color w:val="000000" w:themeColor="text1"/>
+          <w:sz w:val="32"/>
+          <w:szCs w:val="32"/>
+          <w:shd w:val="clear" w:color="auto" w:fill="FFFFFF"/>
         </w:rPr>
         <w:t xml:space="preserve"> </w:t>
       </w:r>
       <w:r>
         <w:rPr>
-          <w:rFonts w:ascii="TH SarabunIT๙" w:hAnsi="TH SarabunIT๙" w:cs="TH SarabunIT๙"/>
-          <w:color w:val="000000" w:themeColor="text1"/>
-          <w:sz w:val="32"/>
-          <w:szCs w:val="32"/>
-          <w:lang w:bidi="th-TH"/>
+          <w:rFonts w:ascii="TH Sarabun New" w:hAnsi="TH Sarabun New" w:cs="TH Sarabun New" w:hint="cs"/>
+          <w:color w:val="000000" w:themeColor="text1"/>
+          <w:sz w:val="32"/>
+          <w:szCs w:val="32"/>
+          <w:shd w:val="clear" w:color="auto" w:fill="FFFFFF"/>
+          <w:cs/>
+          <w:lang w:bidi="th-TH"/>
+        </w:rPr>
+        <w:t xml:space="preserve"> </w:t>
+      </w:r>
+      <w:r>
+        <w:rPr>
+          <w:rFonts w:ascii="TH Sarabun New" w:hAnsi="TH Sarabun New" w:cs="TH Sarabun New"/>
+          <w:color w:val="000000" w:themeColor="text1"/>
+          <w:sz w:val="32"/>
+          <w:szCs w:val="32"/>
+          <w:shd w:val="clear" w:color="auto" w:fill="FFFFFF"/>
         </w:rPr>
         <w:t>{{</w:t>
       </w:r>
       <w:proofErr w:type="spellStart"/>
       <w:r>
         <w:rPr>
-          <w:rFonts w:ascii="TH SarabunIT๙" w:hAnsi="TH SarabunIT๙" w:cs="TH SarabunIT๙"/>
-          <w:color w:val="000000" w:themeColor="text1"/>
-          <w:sz w:val="32"/>
-          <w:szCs w:val="32"/>
-          <w:lang w:bidi="th-TH"/>
-        </w:rPr>
-        <w:t>meeting_no</w:t>
+          <w:rFonts w:ascii="TH Sarabun New" w:hAnsi="TH Sarabun New" w:cs="TH Sarabun New"/>
+          <w:color w:val="000000" w:themeColor="text1"/>
+          <w:sz w:val="32"/>
+          <w:szCs w:val="32"/>
+          <w:shd w:val="clear" w:color="auto" w:fill="FFFFFF"/>
+        </w:rPr>
+        <w:t>subject_</w:t>
+      </w:r>
+      <w:r>
+        <w:rPr>
+          <w:rFonts w:ascii="TH Sarabun New" w:hAnsi="TH Sarabun New" w:cs="TH Sarabun New"/>
+          <w:color w:val="000000" w:themeColor="text1"/>
+          <w:sz w:val="32"/>
+          <w:szCs w:val="32"/>
+          <w:shd w:val="clear" w:color="auto" w:fill="FFFFFF"/>
+        </w:rPr>
+        <w:t>code</w:t>
       </w:r>
       <w:proofErr w:type="spellEnd"/>
       <w:r>
         <w:rPr>
-          <w:rFonts w:ascii="TH SarabunIT๙" w:hAnsi="TH SarabunIT๙" w:cs="TH SarabunIT๙"/>
-          <w:color w:val="000000" w:themeColor="text1"/>
-          <w:sz w:val="32"/>
-          <w:szCs w:val="32"/>
-          <w:lang w:bidi="th-TH"/>
+          <w:rFonts w:ascii="TH Sarabun New" w:hAnsi="TH Sarabun New" w:cs="TH Sarabun New"/>
+          <w:color w:val="000000" w:themeColor="text1"/>
+          <w:sz w:val="32"/>
+          <w:szCs w:val="32"/>
+          <w:shd w:val="clear" w:color="auto" w:fill="FFFFFF"/>
+        </w:rPr>
+        <w:t xml:space="preserve">}} </w:t>
+      </w:r>
+      <w:r>
+        <w:rPr>
+          <w:rFonts w:ascii="TH Sarabun New" w:hAnsi="TH Sarabun New" w:cs="TH Sarabun New" w:hint="cs"/>
+          <w:color w:val="000000" w:themeColor="text1"/>
+          <w:sz w:val="32"/>
+          <w:szCs w:val="32"/>
+          <w:shd w:val="clear" w:color="auto" w:fill="FFFFFF"/>
+          <w:cs/>
+          <w:lang w:bidi="th-TH"/>
+        </w:rPr>
+        <w:t>ร</w:t>
+      </w:r>
+      <w:r>
+        <w:rPr>
+          <w:rFonts w:ascii="TH SarabunIT๙" w:hAnsi="TH SarabunIT๙" w:cs="TH SarabunIT๙"/>
+          <w:color w:val="000000" w:themeColor="text1"/>
+          <w:sz w:val="32"/>
+          <w:szCs w:val="32"/>
+          <w:cs/>
+        </w:rPr>
+        <w:t>ายวิชา</w:t>
+      </w:r>
+      <w:r>
+        <w:rPr>
+          <w:rFonts w:ascii="TH SarabunIT๙" w:hAnsi="TH SarabunIT๙" w:cs="TH SarabunIT๙" w:hint="cs"/>
+          <w:color w:val="000000" w:themeColor="text1"/>
+          <w:sz w:val="32"/>
+          <w:szCs w:val="32"/>
+          <w:cs/>
+          <w:lang w:bidi="th-TH"/>
+        </w:rPr>
+        <w:t xml:space="preserve">  </w:t>
+      </w:r>
+      <w:r>
+        <w:rPr>
+          <w:rFonts w:ascii="TH Sarabun New" w:hAnsi="TH Sarabun New" w:cs="TH Sarabun New"/>
+          <w:color w:val="000000" w:themeColor="text1"/>
+          <w:sz w:val="32"/>
+          <w:szCs w:val="32"/>
+          <w:shd w:val="clear" w:color="auto" w:fill="FFFFFF"/>
+        </w:rPr>
+        <w:t>{{</w:t>
+      </w:r>
+      <w:proofErr w:type="spellStart"/>
+      <w:r>
+        <w:rPr>
+          <w:rFonts w:ascii="TH Sarabun New" w:hAnsi="TH Sarabun New" w:cs="TH Sarabun New"/>
+          <w:color w:val="000000" w:themeColor="text1"/>
+          <w:sz w:val="32"/>
+          <w:szCs w:val="32"/>
+          <w:shd w:val="clear" w:color="auto" w:fill="FFFFFF"/>
+        </w:rPr>
+        <w:t>subject_name</w:t>
+      </w:r>
+      <w:proofErr w:type="spellEnd"/>
+      <w:r>
+        <w:rPr>
+          <w:rFonts w:ascii="TH Sarabun New" w:hAnsi="TH Sarabun New" w:cs="TH Sarabun New"/>
+          <w:color w:val="000000" w:themeColor="text1"/>
+          <w:sz w:val="32"/>
+          <w:szCs w:val="32"/>
+          <w:shd w:val="clear" w:color="auto" w:fill="FFFFFF"/>
         </w:rPr>
         <w:t>}}</w:t>
       </w:r>
       <w:r>
         <w:rPr>
-          <w:rFonts w:ascii="TH SarabunIT๙" w:hAnsi="TH SarabunIT๙" w:cs="TH SarabunIT๙"/>
-          <w:color w:val="000000" w:themeColor="text1"/>
-          <w:sz w:val="32"/>
-          <w:szCs w:val="32"/>
-        </w:rPr>
-        <w:t xml:space="preserve"> </w:t>
+          <w:rFonts w:ascii="TH Sarabun New" w:hAnsi="TH Sarabun New" w:cs="TH Sarabun New"/>
+          <w:color w:val="000000" w:themeColor="text1"/>
+          <w:sz w:val="32"/>
+          <w:szCs w:val="32"/>
+          <w:shd w:val="clear" w:color="auto" w:fill="FFFFFF"/>
+        </w:rPr>
+        <w:t> </w:t>
+      </w:r>
+      <w:r>
+        <w:rPr>
+          <w:rFonts w:ascii="TH SarabunIT๙" w:hAnsi="TH SarabunIT๙" w:cs="TH SarabunIT๙"/>
+          <w:color w:val="000000" w:themeColor="text1"/>
+          <w:sz w:val="32"/>
+          <w:szCs w:val="32"/>
+          <w:cs/>
+        </w:rPr>
+        <w:t xml:space="preserve">ของ </w:t>
+      </w:r>
+      <w:r>
+        <w:rPr>
+          <w:rFonts w:ascii="TH SarabunIT๙" w:hAnsi="TH SarabunIT๙" w:cs="TH SarabunIT๙"/>
+          <w:color w:val="000000" w:themeColor="text1"/>
+          <w:sz w:val="32"/>
+          <w:szCs w:val="32"/>
+          <w:lang w:bidi="th-TH"/>
+        </w:rPr>
+        <w:t>{{</w:t>
       </w:r>
       <w:proofErr w:type="spellStart"/>
       <w:r>
@@ -186,9 +500,9 @@
           <w:color w:val="000000" w:themeColor="text1"/>
           <w:sz w:val="32"/>
           <w:szCs w:val="32"/>
-          <w:cs/>
-        </w:rPr>
-        <w:t>เมื่อวันที่</w:t>
+          <w:lang w:bidi="th-TH"/>
+        </w:rPr>
+        <w:t>applicant_name</w:t>
       </w:r>
       <w:proofErr w:type="spellEnd"/>
       <w:r>
@@ -197,429 +511,20 @@
           <w:color w:val="000000" w:themeColor="text1"/>
           <w:sz w:val="32"/>
           <w:szCs w:val="32"/>
-        </w:rPr>
-        <w:t xml:space="preserve"> </w:t>
-      </w:r>
-      <w:r>
-        <w:rPr>
-          <w:rFonts w:ascii="TH SarabunIT๙" w:hAnsi="TH SarabunIT๙" w:cs="TH SarabunIT๙"/>
-          <w:color w:val="000000" w:themeColor="text1"/>
-          <w:sz w:val="32"/>
-          <w:szCs w:val="32"/>
-          <w:lang w:bidi="th-TH"/>
-        </w:rPr>
-        <w:t>{{</w:t>
-      </w:r>
-      <w:proofErr w:type="spellStart"/>
-      <w:r>
-        <w:rPr>
-          <w:rFonts w:ascii="TH SarabunIT๙" w:hAnsi="TH SarabunIT๙" w:cs="TH SarabunIT๙"/>
-          <w:color w:val="000000" w:themeColor="text1"/>
-          <w:sz w:val="32"/>
-          <w:szCs w:val="32"/>
-          <w:lang w:bidi="th-TH"/>
-        </w:rPr>
-        <w:t>meet_day</w:t>
-      </w:r>
-      <w:proofErr w:type="spellEnd"/>
-      <w:r>
-        <w:rPr>
-          <w:rFonts w:ascii="TH SarabunIT๙" w:hAnsi="TH SarabunIT๙" w:cs="TH SarabunIT๙"/>
-          <w:color w:val="000000" w:themeColor="text1"/>
-          <w:sz w:val="32"/>
-          <w:szCs w:val="32"/>
           <w:lang w:bidi="th-TH"/>
         </w:rPr>
         <w:t>}}</w:t>
       </w:r>
       <w:r>
         <w:rPr>
-          <w:rFonts w:ascii="TH SarabunIT๙" w:hAnsi="TH SarabunIT๙" w:cs="TH SarabunIT๙" w:hint="cs"/>
-          <w:color w:val="000000" w:themeColor="text1"/>
-          <w:sz w:val="32"/>
-          <w:szCs w:val="32"/>
-          <w:cs/>
-          <w:lang w:bidi="th-TH"/>
-        </w:rPr>
-        <w:t xml:space="preserve"> </w:t>
-      </w:r>
-      <w:r>
-        <w:rPr>
-          <w:rFonts w:ascii="TH SarabunIT๙" w:hAnsi="TH SarabunIT๙" w:cs="TH SarabunIT๙"/>
-          <w:color w:val="000000" w:themeColor="text1"/>
-          <w:sz w:val="32"/>
-          <w:szCs w:val="32"/>
-          <w:lang w:bidi="th-TH"/>
-        </w:rPr>
-        <w:t>{{</w:t>
-      </w:r>
-      <w:proofErr w:type="spellStart"/>
-      <w:r>
-        <w:rPr>
-          <w:rFonts w:ascii="TH SarabunIT๙" w:hAnsi="TH SarabunIT๙" w:cs="TH SarabunIT๙"/>
-          <w:color w:val="000000" w:themeColor="text1"/>
-          <w:sz w:val="32"/>
-          <w:szCs w:val="32"/>
-          <w:lang w:bidi="th-TH"/>
-        </w:rPr>
-        <w:t>meet_month</w:t>
-      </w:r>
-      <w:proofErr w:type="spellEnd"/>
-      <w:r>
-        <w:rPr>
-          <w:rFonts w:ascii="TH SarabunIT๙" w:hAnsi="TH SarabunIT๙" w:cs="TH SarabunIT๙"/>
-          <w:color w:val="000000" w:themeColor="text1"/>
-          <w:sz w:val="32"/>
-          <w:szCs w:val="32"/>
-          <w:lang w:bidi="th-TH"/>
-        </w:rPr>
-        <w:t xml:space="preserve">}} </w:t>
-      </w:r>
-      <w:r>
-        <w:rPr>
-          <w:rFonts w:ascii="TH SarabunIT๙" w:hAnsi="TH SarabunIT๙" w:cs="TH SarabunIT๙"/>
-          <w:color w:val="000000" w:themeColor="text1"/>
-          <w:sz w:val="32"/>
-          <w:szCs w:val="32"/>
-          <w:lang w:bidi="th-TH"/>
-        </w:rPr>
-        <w:t>{{</w:t>
-      </w:r>
-      <w:proofErr w:type="spellStart"/>
-      <w:r>
-        <w:rPr>
-          <w:rFonts w:ascii="TH SarabunIT๙" w:hAnsi="TH SarabunIT๙" w:cs="TH SarabunIT๙"/>
-          <w:color w:val="000000" w:themeColor="text1"/>
-          <w:sz w:val="32"/>
-          <w:szCs w:val="32"/>
-          <w:lang w:bidi="th-TH"/>
-        </w:rPr>
-        <w:t>meet_year</w:t>
-      </w:r>
-      <w:proofErr w:type="spellEnd"/>
-      <w:proofErr w:type="gramStart"/>
-      <w:r>
-        <w:rPr>
-          <w:rFonts w:ascii="TH SarabunIT๙" w:hAnsi="TH SarabunIT๙" w:cs="TH SarabunIT๙"/>
-          <w:color w:val="000000" w:themeColor="text1"/>
-          <w:sz w:val="32"/>
-          <w:szCs w:val="32"/>
-          <w:lang w:bidi="th-TH"/>
-        </w:rPr>
-        <w:t>}}</w:t>
-      </w:r>
-      <w:r>
-        <w:rPr>
-          <w:rFonts w:ascii="TH SarabunIT๙" w:hAnsi="TH SarabunIT๙" w:cs="TH SarabunIT๙" w:hint="cs"/>
-          <w:color w:val="000000" w:themeColor="text1"/>
-          <w:sz w:val="32"/>
-          <w:szCs w:val="32"/>
-          <w:cs/>
-          <w:lang w:bidi="th-TH"/>
-        </w:rPr>
-        <w:t xml:space="preserve">  </w:t>
-      </w:r>
-      <w:proofErr w:type="spellStart"/>
-      <w:r>
-        <w:rPr>
-          <w:rFonts w:ascii="TH SarabunIT๙" w:hAnsi="TH SarabunIT๙" w:cs="TH SarabunIT๙"/>
-          <w:color w:val="000000" w:themeColor="text1"/>
-          <w:sz w:val="32"/>
-          <w:szCs w:val="32"/>
-          <w:cs/>
-        </w:rPr>
-        <w:t>ซึ่งได้รับมอบอำนาจจากคณะกรรมการพิจารณาตำแหน่งทางวิชาการ</w:t>
-      </w:r>
-      <w:proofErr w:type="spellEnd"/>
-      <w:r>
-        <w:rPr>
-          <w:rFonts w:ascii="TH SarabunIT๙" w:hAnsi="TH SarabunIT๙" w:cs="TH SarabunIT๙" w:hint="cs"/>
-          <w:color w:val="000000" w:themeColor="text1"/>
-          <w:sz w:val="32"/>
-          <w:szCs w:val="32"/>
-          <w:cs/>
-          <w:lang w:bidi="th-TH"/>
-        </w:rPr>
-        <w:t>มหาวิทยาลัยขอนแก่น</w:t>
-      </w:r>
-      <w:proofErr w:type="gramEnd"/>
-      <w:r>
-        <w:rPr>
-          <w:rFonts w:ascii="TH SarabunIT๙" w:hAnsi="TH SarabunIT๙" w:cs="TH SarabunIT๙"/>
-          <w:color w:val="000000" w:themeColor="text1"/>
-          <w:sz w:val="32"/>
-          <w:szCs w:val="32"/>
-          <w:cs/>
-        </w:rPr>
-        <w:t xml:space="preserve"> </w:t>
-      </w:r>
-      <w:proofErr w:type="spellStart"/>
-      <w:proofErr w:type="gramStart"/>
-      <w:r>
-        <w:rPr>
-          <w:rFonts w:ascii="TH SarabunIT๙" w:hAnsi="TH SarabunIT๙" w:cs="TH SarabunIT๙"/>
-          <w:color w:val="000000" w:themeColor="text1"/>
-          <w:sz w:val="32"/>
-          <w:szCs w:val="32"/>
-          <w:cs/>
-        </w:rPr>
-        <w:t>ได้ประเมินผลการสอนรหัสวิชา</w:t>
-      </w:r>
-      <w:proofErr w:type="spellEnd"/>
-      <w:r>
-        <w:rPr>
-          <w:rFonts w:ascii="TH Sarabun New" w:hAnsi="TH Sarabun New" w:cs="TH Sarabun New"/>
-          <w:color w:val="000000" w:themeColor="text1"/>
-          <w:sz w:val="32"/>
-          <w:szCs w:val="32"/>
-          <w:shd w:val="clear" w:color="auto" w:fill="FFFFFF"/>
-        </w:rPr>
-        <w:t xml:space="preserve"> </w:t>
-      </w:r>
-      <w:r>
-        <w:rPr>
-          <w:rFonts w:ascii="TH Sarabun New" w:hAnsi="TH Sarabun New" w:cs="TH Sarabun New" w:hint="cs"/>
-          <w:color w:val="000000" w:themeColor="text1"/>
-          <w:sz w:val="32"/>
-          <w:szCs w:val="32"/>
-          <w:shd w:val="clear" w:color="auto" w:fill="FFFFFF"/>
-          <w:cs/>
-          <w:lang w:bidi="th-TH"/>
-        </w:rPr>
-        <w:t xml:space="preserve"> </w:t>
-      </w:r>
-      <w:r>
-        <w:rPr>
-          <w:rFonts w:ascii="TH Sarabun New" w:hAnsi="TH Sarabun New" w:cs="TH Sarabun New"/>
-          <w:color w:val="000000" w:themeColor="text1"/>
-          <w:sz w:val="32"/>
-          <w:szCs w:val="32"/>
-          <w:shd w:val="clear" w:color="auto" w:fill="FFFFFF"/>
-        </w:rPr>
-        <w:t>{</w:t>
-      </w:r>
-      <w:proofErr w:type="gramEnd"/>
-      <w:r>
-        <w:rPr>
-          <w:rFonts w:ascii="TH Sarabun New" w:hAnsi="TH Sarabun New" w:cs="TH Sarabun New"/>
-          <w:color w:val="000000" w:themeColor="text1"/>
-          <w:sz w:val="32"/>
-          <w:szCs w:val="32"/>
-          <w:shd w:val="clear" w:color="auto" w:fill="FFFFFF"/>
-        </w:rPr>
-        <w:t>{</w:t>
-      </w:r>
-      <w:proofErr w:type="spellStart"/>
-      <w:r>
-        <w:rPr>
-          <w:rFonts w:ascii="TH Sarabun New" w:hAnsi="TH Sarabun New" w:cs="TH Sarabun New"/>
-          <w:color w:val="000000" w:themeColor="text1"/>
-          <w:sz w:val="32"/>
-          <w:szCs w:val="32"/>
-          <w:shd w:val="clear" w:color="auto" w:fill="FFFFFF"/>
-        </w:rPr>
-        <w:t>subject_</w:t>
-      </w:r>
-      <w:r>
-        <w:rPr>
-          <w:rFonts w:ascii="TH Sarabun New" w:hAnsi="TH Sarabun New" w:cs="TH Sarabun New"/>
-          <w:color w:val="000000" w:themeColor="text1"/>
-          <w:sz w:val="32"/>
-          <w:szCs w:val="32"/>
-          <w:shd w:val="clear" w:color="auto" w:fill="FFFFFF"/>
-        </w:rPr>
-        <w:t>code</w:t>
-      </w:r>
-      <w:proofErr w:type="spellEnd"/>
-      <w:r>
-        <w:rPr>
-          <w:rFonts w:ascii="TH Sarabun New" w:hAnsi="TH Sarabun New" w:cs="TH Sarabun New"/>
-          <w:color w:val="000000" w:themeColor="text1"/>
-          <w:sz w:val="32"/>
-          <w:szCs w:val="32"/>
-          <w:shd w:val="clear" w:color="auto" w:fill="FFFFFF"/>
-        </w:rPr>
-        <w:t xml:space="preserve">}} </w:t>
-      </w:r>
-      <w:proofErr w:type="gramStart"/>
-      <w:r>
-        <w:rPr>
-          <w:rFonts w:ascii="TH Sarabun New" w:hAnsi="TH Sarabun New" w:cs="TH Sarabun New" w:hint="cs"/>
-          <w:color w:val="000000" w:themeColor="text1"/>
-          <w:sz w:val="32"/>
-          <w:szCs w:val="32"/>
-          <w:shd w:val="clear" w:color="auto" w:fill="FFFFFF"/>
-          <w:cs/>
-          <w:lang w:bidi="th-TH"/>
-        </w:rPr>
-        <w:t>ร</w:t>
-      </w:r>
-      <w:proofErr w:type="spellStart"/>
-      <w:r>
-        <w:rPr>
-          <w:rFonts w:ascii="TH SarabunIT๙" w:hAnsi="TH SarabunIT๙" w:cs="TH SarabunIT๙"/>
-          <w:color w:val="000000" w:themeColor="text1"/>
-          <w:sz w:val="32"/>
-          <w:szCs w:val="32"/>
-          <w:cs/>
-        </w:rPr>
-        <w:t>ายวิชา</w:t>
-      </w:r>
-      <w:proofErr w:type="spellEnd"/>
-      <w:r>
-        <w:rPr>
-          <w:rFonts w:ascii="TH SarabunIT๙" w:hAnsi="TH SarabunIT๙" w:cs="TH SarabunIT๙" w:hint="cs"/>
-          <w:color w:val="000000" w:themeColor="text1"/>
-          <w:sz w:val="32"/>
-          <w:szCs w:val="32"/>
-          <w:cs/>
-          <w:lang w:bidi="th-TH"/>
-        </w:rPr>
-        <w:t xml:space="preserve">  </w:t>
-      </w:r>
-      <w:r>
-        <w:rPr>
-          <w:rFonts w:ascii="TH Sarabun New" w:hAnsi="TH Sarabun New" w:cs="TH Sarabun New"/>
-          <w:color w:val="000000" w:themeColor="text1"/>
-          <w:sz w:val="32"/>
-          <w:szCs w:val="32"/>
-          <w:shd w:val="clear" w:color="auto" w:fill="FFFFFF"/>
-        </w:rPr>
-        <w:t>{</w:t>
-      </w:r>
-      <w:proofErr w:type="gramEnd"/>
-      <w:r>
-        <w:rPr>
-          <w:rFonts w:ascii="TH Sarabun New" w:hAnsi="TH Sarabun New" w:cs="TH Sarabun New"/>
-          <w:color w:val="000000" w:themeColor="text1"/>
-          <w:sz w:val="32"/>
-          <w:szCs w:val="32"/>
-          <w:shd w:val="clear" w:color="auto" w:fill="FFFFFF"/>
-        </w:rPr>
-        <w:t>{</w:t>
-      </w:r>
-      <w:proofErr w:type="spellStart"/>
-      <w:r>
-        <w:rPr>
-          <w:rFonts w:ascii="TH Sarabun New" w:hAnsi="TH Sarabun New" w:cs="TH Sarabun New"/>
-          <w:color w:val="000000" w:themeColor="text1"/>
-          <w:sz w:val="32"/>
-          <w:szCs w:val="32"/>
-          <w:shd w:val="clear" w:color="auto" w:fill="FFFFFF"/>
-        </w:rPr>
-        <w:t>subject_name</w:t>
-      </w:r>
-      <w:proofErr w:type="spellEnd"/>
-      <w:r>
-        <w:rPr>
-          <w:rFonts w:ascii="TH Sarabun New" w:hAnsi="TH Sarabun New" w:cs="TH Sarabun New"/>
-          <w:color w:val="000000" w:themeColor="text1"/>
-          <w:sz w:val="32"/>
-          <w:szCs w:val="32"/>
-          <w:shd w:val="clear" w:color="auto" w:fill="FFFFFF"/>
-        </w:rPr>
-        <w:t>}}</w:t>
-      </w:r>
-      <w:r>
-        <w:rPr>
-          <w:rFonts w:ascii="TH Sarabun New" w:hAnsi="TH Sarabun New" w:cs="TH Sarabun New"/>
-          <w:color w:val="000000" w:themeColor="text1"/>
-          <w:sz w:val="32"/>
-          <w:szCs w:val="32"/>
-          <w:shd w:val="clear" w:color="auto" w:fill="FFFFFF"/>
-        </w:rPr>
-        <w:t> </w:t>
-      </w:r>
-      <w:proofErr w:type="spellStart"/>
-      <w:r>
-        <w:rPr>
-          <w:rFonts w:ascii="TH SarabunIT๙" w:hAnsi="TH SarabunIT๙" w:cs="TH SarabunIT๙"/>
-          <w:color w:val="000000" w:themeColor="text1"/>
-          <w:sz w:val="32"/>
-          <w:szCs w:val="32"/>
-          <w:cs/>
-        </w:rPr>
-        <w:t>ของ</w:t>
-      </w:r>
-      <w:proofErr w:type="spellEnd"/>
-      <w:r>
-        <w:rPr>
-          <w:rFonts w:ascii="TH SarabunIT๙" w:hAnsi="TH SarabunIT๙" w:cs="TH SarabunIT๙"/>
-          <w:color w:val="000000" w:themeColor="text1"/>
-          <w:sz w:val="32"/>
-          <w:szCs w:val="32"/>
-          <w:cs/>
-        </w:rPr>
-        <w:t xml:space="preserve"> </w:t>
-      </w:r>
-      <w:r>
-        <w:rPr>
-          <w:rFonts w:ascii="TH SarabunIT๙" w:hAnsi="TH SarabunIT๙" w:cs="TH SarabunIT๙"/>
-          <w:color w:val="000000" w:themeColor="text1"/>
-          <w:sz w:val="32"/>
-          <w:szCs w:val="32"/>
-          <w:lang w:bidi="th-TH"/>
-        </w:rPr>
-        <w:t>{{</w:t>
-      </w:r>
-      <w:proofErr w:type="spellStart"/>
-      <w:r>
-        <w:rPr>
-          <w:rFonts w:ascii="TH SarabunIT๙" w:hAnsi="TH SarabunIT๙" w:cs="TH SarabunIT๙"/>
-          <w:color w:val="000000" w:themeColor="text1"/>
-          <w:sz w:val="32"/>
-          <w:szCs w:val="32"/>
-          <w:lang w:bidi="th-TH"/>
-        </w:rPr>
-        <w:t>applicant_name</w:t>
-      </w:r>
-      <w:proofErr w:type="spellEnd"/>
-      <w:proofErr w:type="gramStart"/>
-      <w:r>
-        <w:rPr>
-          <w:rFonts w:ascii="TH SarabunIT๙" w:hAnsi="TH SarabunIT๙" w:cs="TH SarabunIT๙"/>
-          <w:color w:val="000000" w:themeColor="text1"/>
-          <w:sz w:val="32"/>
-          <w:szCs w:val="32"/>
-          <w:lang w:bidi="th-TH"/>
-        </w:rPr>
-        <w:t>}}</w:t>
-      </w:r>
-      <w:proofErr w:type="spellStart"/>
-      <w:r>
-        <w:rPr>
-          <w:rFonts w:ascii="TH SarabunIT๙" w:hAnsi="TH SarabunIT๙" w:cs="TH SarabunIT๙"/>
-          <w:color w:val="000000" w:themeColor="text1"/>
-          <w:sz w:val="32"/>
-          <w:szCs w:val="32"/>
-          <w:cs/>
-        </w:rPr>
-        <w:t>แล้วเห็นว่า</w:t>
-      </w:r>
-      <w:proofErr w:type="spellEnd"/>
-      <w:proofErr w:type="gramEnd"/>
-      <w:r>
-        <w:rPr>
-          <w:rFonts w:ascii="TH SarabunIT๙" w:hAnsi="TH SarabunIT๙" w:cs="TH SarabunIT๙"/>
-          <w:color w:val="000000" w:themeColor="text1"/>
-          <w:sz w:val="32"/>
-          <w:szCs w:val="32"/>
-          <w:cs/>
-        </w:rPr>
-        <w:t xml:space="preserve"> </w:t>
-      </w:r>
-      <w:proofErr w:type="spellStart"/>
-      <w:r>
-        <w:rPr>
-          <w:rFonts w:ascii="TH SarabunIT๙" w:hAnsi="TH SarabunIT๙" w:cs="TH SarabunIT๙"/>
-          <w:color w:val="000000" w:themeColor="text1"/>
-          <w:sz w:val="32"/>
-          <w:szCs w:val="32"/>
-          <w:cs/>
-        </w:rPr>
-        <w:t>บุคคลดังกล่าวเป็นผู้มีความ</w:t>
-      </w:r>
-      <w:proofErr w:type="spellEnd"/>
+          <w:rFonts w:ascii="TH SarabunIT๙" w:hAnsi="TH SarabunIT๙" w:cs="TH SarabunIT๙"/>
+          <w:color w:val="000000" w:themeColor="text1"/>
+          <w:sz w:val="32"/>
+          <w:szCs w:val="32"/>
+          <w:cs/>
+        </w:rPr>
+        <w:t>แล้วเห็นว่า บุคคลดังกล่าวเป็นผู้มีความ</w:t>
+      </w:r>
     </w:p>
     <w:p>
       <w:pPr>
@@ -685,7 +590,7 @@
           <w:szCs w:val="32"/>
           <w:lang w:bidi="th-TH"/>
         </w:rPr>
-        <w:t>level_skilled</w:t>
+        <w:t>eval_level</w:t>
       </w:r>
       <w:proofErr w:type="spellEnd"/>
       <w:r>
@@ -825,7 +730,7 @@
           <w:szCs w:val="32"/>
           <w:lang w:bidi="th-TH"/>
         </w:rPr>
-        <w:t>level_specialist</w:t>
+        <w:t>eval_level</w:t>
       </w:r>
       <w:proofErr w:type="spellEnd"/>
       <w:r>
@@ -924,7 +829,7 @@
           <w:szCs w:val="32"/>
           <w:lang w:bidi="th-TH"/>
         </w:rPr>
-        <w:t>level_expert</w:t>
+        <w:t>eval_level</w:t>
       </w:r>
       <w:proofErr w:type="spellEnd"/>
       <w:r>
@@ -1144,21 +1049,61 @@
           <w:szCs w:val="32"/>
         </w:rPr>
       </w:pPr>
+      <w:r>
+        <w:rPr>
+          <w:rFonts w:ascii="TH SarabunIT๙" w:hAnsi="TH SarabunIT๙" w:cs="TH SarabunIT๙"/>
+          <w:color w:val="000000" w:themeColor="text1"/>
+          <w:sz w:val="32"/>
+          <w:szCs w:val="32"/>
+          <w:cs/>
+        </w:rPr>
+        <w:t>วันที่</w:t>
+      </w:r>
+      <w:r>
+        <w:rPr>
+          <w:rFonts w:ascii="TH SarabunIT๙" w:hAnsi="TH SarabunIT๙" w:cs="TH SarabunIT๙" w:hint="cs"/>
+          <w:color w:val="000000" w:themeColor="text1"/>
+          <w:sz w:val="32"/>
+          <w:szCs w:val="32"/>
+          <w:cs/>
+          <w:lang w:bidi="th-TH"/>
+        </w:rPr>
+        <w:t xml:space="preserve">  </w:t>
+      </w:r>
+      <w:r>
+        <w:rPr>
+          <w:rFonts w:ascii="TH Sarabun New" w:hAnsi="TH Sarabun New" w:cs="TH Sarabun New"/>
+          <w:color w:val="000000" w:themeColor="text1"/>
+          <w:sz w:val="32"/>
+          <w:szCs w:val="32"/>
+          <w:lang w:bidi="th-TH"/>
+        </w:rPr>
+        <w:t>{{</w:t>
+      </w:r>
       <w:proofErr w:type="spellStart"/>
-      <w:proofErr w:type="gramStart"/>
-      <w:r>
-        <w:rPr>
-          <w:rFonts w:ascii="TH SarabunIT๙" w:hAnsi="TH SarabunIT๙" w:cs="TH SarabunIT๙"/>
-          <w:color w:val="000000" w:themeColor="text1"/>
-          <w:sz w:val="32"/>
-          <w:szCs w:val="32"/>
-          <w:cs/>
-        </w:rPr>
-        <w:t>วันที่</w:t>
+      <w:r>
+        <w:rPr>
+          <w:rFonts w:ascii="TH Sarabun New" w:hAnsi="TH Sarabun New" w:cs="TH Sarabun New"/>
+          <w:color w:val="000000" w:themeColor="text1"/>
+          <w:sz w:val="32"/>
+          <w:szCs w:val="32"/>
+          <w:lang w:bidi="th-TH"/>
+        </w:rPr>
+        <w:t>signed_day</w:t>
       </w:r>
       <w:proofErr w:type="spellEnd"/>
       <w:r>
         <w:rPr>
+          <w:rFonts w:ascii="TH Sarabun New" w:hAnsi="TH Sarabun New" w:cs="TH Sarabun New"/>
+          <w:color w:val="000000" w:themeColor="text1"/>
+          <w:sz w:val="32"/>
+          <w:szCs w:val="32"/>
+          <w:lang w:bidi="th-TH"/>
+        </w:rPr>
+        <w:t>}}</w:t>
+      </w:r>
+      <w:r>
+        <w:rPr>
           <w:rFonts w:ascii="TH SarabunIT๙" w:hAnsi="TH SarabunIT๙" w:cs="TH SarabunIT๙" w:hint="cs"/>
           <w:color w:val="000000" w:themeColor="text1"/>
           <w:sz w:val="32"/>
@@ -1170,24 +1115,34 @@
       </w:r>
       <w:r>
         <w:rPr>
-          <w:rFonts w:ascii="TH Sarabun New" w:hAnsi="TH Sarabun New" w:cs="TH Sarabun New"/>
-          <w:color w:val="000000" w:themeColor="text1"/>
-          <w:sz w:val="32"/>
-          <w:szCs w:val="32"/>
-          <w:lang w:bidi="th-TH"/>
-        </w:rPr>
-        <w:t>{</w:t>
-      </w:r>
-      <w:proofErr w:type="gramEnd"/>
-      <w:r>
-        <w:rPr>
-          <w:rFonts w:ascii="TH Sarabun New" w:hAnsi="TH Sarabun New" w:cs="TH Sarabun New"/>
-          <w:color w:val="000000" w:themeColor="text1"/>
-          <w:sz w:val="32"/>
-          <w:szCs w:val="32"/>
-          <w:lang w:bidi="th-TH"/>
-        </w:rPr>
-        <w:t>{</w:t>
+          <w:rFonts w:ascii="TH SarabunIT๙" w:hAnsi="TH SarabunIT๙" w:cs="TH SarabunIT๙"/>
+          <w:color w:val="000000" w:themeColor="text1"/>
+          <w:sz w:val="32"/>
+          <w:szCs w:val="32"/>
+          <w:cs/>
+        </w:rPr>
+        <w:t>เดือน</w:t>
+      </w:r>
+      <w:r>
+        <w:rPr>
+          <w:rFonts w:ascii="TH SarabunIT๙" w:hAnsi="TH SarabunIT๙" w:cs="TH SarabunIT๙" w:hint="cs"/>
+          <w:color w:val="000000" w:themeColor="text1"/>
+          <w:sz w:val="32"/>
+          <w:szCs w:val="32"/>
+          <w:cs/>
+          <w:lang w:bidi="th-TH"/>
+        </w:rPr>
+        <w:t xml:space="preserve">  </w:t>
+      </w:r>
+      <w:r>
+        <w:rPr>
+          <w:rFonts w:ascii="TH Sarabun New" w:hAnsi="TH Sarabun New" w:cs="TH Sarabun New"/>
+          <w:color w:val="000000" w:themeColor="text1"/>
+          <w:sz w:val="32"/>
+          <w:szCs w:val="32"/>
+          <w:lang w:bidi="th-TH"/>
+        </w:rPr>
+        <w:t>{{</w:t>
       </w:r>
       <w:proofErr w:type="spellStart"/>
       <w:r>
@@ -1198,10 +1153,9 @@
           <w:szCs w:val="32"/>
           <w:lang w:bidi="th-TH"/>
         </w:rPr>
-        <w:t>signed_day</w:t>
+        <w:t>signed_month</w:t>
       </w:r>
       <w:proofErr w:type="spellEnd"/>
-      <w:proofErr w:type="gramStart"/>
       <w:r>
         <w:rPr>
           <w:rFonts w:ascii="TH Sarabun New" w:hAnsi="TH Sarabun New" w:cs="TH Sarabun New"/>
@@ -1223,19 +1177,6 @@
         </w:rPr>
         <w:t xml:space="preserve">  </w:t>
       </w:r>
-      <w:proofErr w:type="spellStart"/>
-      <w:r>
-        <w:rPr>
-          <w:rFonts w:ascii="TH SarabunIT๙" w:hAnsi="TH SarabunIT๙" w:cs="TH SarabunIT๙"/>
-          <w:color w:val="000000" w:themeColor="text1"/>
-          <w:sz w:val="32"/>
-          <w:szCs w:val="32"/>
-          <w:cs/>
-        </w:rPr>
-        <w:t>เดือน</w:t>
-      </w:r>
-      <w:proofErr w:type="spellEnd"/>
-      <w:proofErr w:type="gramEnd"/>
       <w:r>
         <w:rPr>
           <w:rFonts w:ascii="TH SarabunIT๙" w:hAnsi="TH SarabunIT๙" w:cs="TH SarabunIT๙" w:hint="cs"/>
@@ -1249,92 +1190,13 @@
       </w:r>
       <w:r>
         <w:rPr>
-          <w:rFonts w:ascii="TH Sarabun New" w:hAnsi="TH Sarabun New" w:cs="TH Sarabun New"/>
-          <w:color w:val="000000" w:themeColor="text1"/>
-          <w:sz w:val="32"/>
-          <w:szCs w:val="32"/>
-          <w:lang w:bidi="th-TH"/>
-        </w:rPr>
-        <w:t>{{</w:t>
-      </w:r>
-      <w:proofErr w:type="spellStart"/>
-      <w:r>
-        <w:rPr>
-          <w:rFonts w:ascii="TH Sarabun New" w:hAnsi="TH Sarabun New" w:cs="TH Sarabun New"/>
-          <w:color w:val="000000" w:themeColor="text1"/>
-          <w:sz w:val="32"/>
-          <w:szCs w:val="32"/>
-          <w:lang w:bidi="th-TH"/>
-        </w:rPr>
-        <w:t>signed_month</w:t>
-      </w:r>
-      <w:proofErr w:type="spellEnd"/>
-      <w:proofErr w:type="gramStart"/>
-      <w:r>
-        <w:rPr>
-          <w:rFonts w:ascii="TH Sarabun New" w:hAnsi="TH Sarabun New" w:cs="TH Sarabun New"/>
-          <w:color w:val="000000" w:themeColor="text1"/>
-          <w:sz w:val="32"/>
-          <w:szCs w:val="32"/>
-          <w:lang w:bidi="th-TH"/>
-        </w:rPr>
-        <w:t>}}</w:t>
-      </w:r>
-      <w:r>
-        <w:rPr>
-          <w:rFonts w:ascii="TH SarabunIT๙" w:hAnsi="TH SarabunIT๙" w:cs="TH SarabunIT๙" w:hint="cs"/>
-          <w:color w:val="000000" w:themeColor="text1"/>
-          <w:sz w:val="32"/>
-          <w:szCs w:val="32"/>
-          <w:cs/>
-          <w:lang w:bidi="th-TH"/>
-        </w:rPr>
-        <w:t xml:space="preserve">  </w:t>
-      </w:r>
-      <w:r>
-        <w:rPr>
-          <w:rFonts w:ascii="TH SarabunIT๙" w:hAnsi="TH SarabunIT๙" w:cs="TH SarabunIT๙" w:hint="cs"/>
-          <w:color w:val="000000" w:themeColor="text1"/>
-          <w:sz w:val="32"/>
-          <w:szCs w:val="32"/>
-          <w:cs/>
-          <w:lang w:bidi="th-TH"/>
-        </w:rPr>
-        <w:t xml:space="preserve"> </w:t>
-      </w:r>
-      <w:proofErr w:type="gramEnd"/>
-      <w:r>
-        <w:rPr>
-          <w:rFonts w:ascii="TH SarabunIT๙" w:hAnsi="TH SarabunIT๙" w:cs="TH SarabunIT๙" w:hint="cs"/>
-          <w:color w:val="000000" w:themeColor="text1"/>
-          <w:sz w:val="32"/>
-          <w:szCs w:val="32"/>
-          <w:cs/>
-          <w:lang w:bidi="th-TH"/>
-        </w:rPr>
-        <w:t xml:space="preserve"> </w:t>
-      </w:r>
-      <w:proofErr w:type="spellStart"/>
-      <w:r>
-        <w:rPr>
-          <w:rFonts w:ascii="TH SarabunIT๙" w:hAnsi="TH SarabunIT๙" w:cs="TH SarabunIT๙"/>
-          <w:color w:val="000000" w:themeColor="text1"/>
-          <w:sz w:val="32"/>
-          <w:szCs w:val="32"/>
-          <w:cs/>
-        </w:rPr>
-        <w:t>พ.ศ</w:t>
-      </w:r>
-      <w:proofErr w:type="spellEnd"/>
-      <w:r>
-        <w:rPr>
-          <w:rFonts w:ascii="TH SarabunIT๙" w:hAnsi="TH SarabunIT๙" w:cs="TH SarabunIT๙"/>
-          <w:color w:val="000000" w:themeColor="text1"/>
-          <w:sz w:val="32"/>
-          <w:szCs w:val="32"/>
-          <w:cs/>
-        </w:rPr>
-        <w:t>.</w:t>
+          <w:rFonts w:ascii="TH SarabunIT๙" w:hAnsi="TH SarabunIT๙" w:cs="TH SarabunIT๙"/>
+          <w:color w:val="000000" w:themeColor="text1"/>
+          <w:sz w:val="32"/>
+          <w:szCs w:val="32"/>
+          <w:cs/>
+        </w:rPr>
+        <w:t>พ.ศ.</w:t>
       </w:r>
       <w:r>
         <w:rPr>
@@ -1822,17 +1684,16 @@
     <w:lsdException w:name="Unresolved Mention" w:semiHidden="1" w:unhideWhenUsed="1"/>
     <w:lsdException w:name="Smart Link" w:semiHidden="1" w:unhideWhenUsed="1"/>
   </w:latentStyles>
-  <w:style w:type="paragraph" w:default="1" w:styleId="Normal">
+  <w:style w:type="paragraph" w:default="1" w:styleId="a">
     <w:name w:val="Normal"/>
     <w:qFormat/>
   </w:style>
-  <w:style w:type="character" w:default="1" w:styleId="DefaultParagraphFont">
+  <w:style w:type="character" w:default="1" w:styleId="a0">
     <w:name w:val="Default Paragraph Font"/>
     <w:uiPriority w:val="1"/>
-    <w:semiHidden/>
     <w:unhideWhenUsed/>
   </w:style>
-  <w:style w:type="table" w:default="1" w:styleId="TableNormal">
+  <w:style w:type="table" w:default="1" w:styleId="a1">
     <w:name w:val="Normal Table"/>
     <w:uiPriority w:val="99"/>
     <w:semiHidden/>
@@ -1847,7 +1708,7 @@
       </w:tblCellMar>
     </w:tblPr>
   </w:style>
-  <w:style w:type="numbering" w:default="1" w:styleId="NoList">
+  <w:style w:type="numbering" w:default="1" w:styleId="a2">
     <w:name w:val="No List"/>
     <w:uiPriority w:val="99"/>
     <w:semiHidden/>

</xml_diff>

<commit_message>
Add attachment support & revamp doc6 scoring
Introduce AcademicAttachment entity and repository, and add attachment CRUD flows: upload (with type/size checks, unique stored names, 10-file limit), download and delete endpoints in the admin controller, service methods, and UI listing in request_detail. Revamp document-6 scoring to use one section score (sec_score_X) instead of 5 per-item inputs: updated backend calculations, score-range mapping, weighted formulas, and corresponding frontend inputs/JS to auto-calculate ranges and totals; prefill doc7/doc8 from doc6 and set eval_result_level for downstream documents. Misc fixes: replace getFirst() with get(0) usages, XWPFRun indexing fix, update application.properties (DB URL and Hibernate dialect), add a sample uploaded doc and update generated resources/classes. UI/UX improvements include error/success messages for attachment actions and preserving existing form data on load.
</commit_message>
<xml_diff>
--- a/shopping-cart-spring-boot-main/src/main/resources/templates/docx/doc_7.docx
+++ b/shopping-cart-spring-boot-main/src/main/resources/templates/docx/doc_7.docx
@@ -166,6 +166,7 @@
         </w:rPr>
         <w:t xml:space="preserve"> </w:t>
       </w:r>
+      <w:proofErr w:type="spellStart"/>
       <w:r>
         <w:rPr>
           <w:rFonts w:ascii="TH SarabunIT๙" w:hAnsi="TH SarabunIT๙" w:cs="TH SarabunIT๙"/>
@@ -176,6 +177,7 @@
         </w:rPr>
         <w:t>เมื่อวันที่</w:t>
       </w:r>
+      <w:proofErr w:type="spellEnd"/>
       <w:r>
         <w:rPr>
           <w:rFonts w:ascii="TH SarabunIT๙" w:hAnsi="TH SarabunIT๙" w:cs="TH SarabunIT๙"/>
@@ -282,6 +284,7 @@
         <w:t>meet_year</w:t>
       </w:r>
       <w:proofErr w:type="spellEnd"/>
+      <w:proofErr w:type="gramStart"/>
       <w:r>
         <w:rPr>
           <w:rFonts w:ascii="TH SarabunIT๙" w:hAnsi="TH SarabunIT๙" w:cs="TH SarabunIT๙"/>
@@ -303,6 +306,7 @@
         </w:rPr>
         <w:t xml:space="preserve">  </w:t>
       </w:r>
+      <w:proofErr w:type="spellStart"/>
       <w:r>
         <w:rPr>
           <w:rFonts w:ascii="TH SarabunIT๙" w:hAnsi="TH SarabunIT๙" w:cs="TH SarabunIT๙"/>
@@ -313,6 +317,7 @@
         </w:rPr>
         <w:t>ซึ่งได้รับมอบอำนาจจากคณะกรรมการพิจารณาตำแหน่งทางวิชาการ</w:t>
       </w:r>
+      <w:proofErr w:type="spellEnd"/>
       <w:r>
         <w:rPr>
           <w:rFonts w:ascii="TH SarabunIT๙" w:hAnsi="TH SarabunIT๙" w:cs="TH SarabunIT๙" w:hint="cs"/>
@@ -324,16 +329,30 @@
         </w:rPr>
         <w:t>มหาวิทยาลัยขอนแก่น</w:t>
       </w:r>
-      <w:r>
-        <w:rPr>
-          <w:rFonts w:ascii="TH SarabunIT๙" w:hAnsi="TH SarabunIT๙" w:cs="TH SarabunIT๙"/>
-          <w:color w:val="000000" w:themeColor="text1"/>
-          <w:sz w:val="32"/>
-          <w:szCs w:val="32"/>
-          <w:cs/>
-        </w:rPr>
-        <w:t xml:space="preserve"> ได้ประเมินผลการสอนรหัสวิชา</w:t>
-      </w:r>
+      <w:proofErr w:type="gramEnd"/>
+      <w:r>
+        <w:rPr>
+          <w:rFonts w:ascii="TH SarabunIT๙" w:hAnsi="TH SarabunIT๙" w:cs="TH SarabunIT๙"/>
+          <w:color w:val="000000" w:themeColor="text1"/>
+          <w:sz w:val="32"/>
+          <w:szCs w:val="32"/>
+          <w:cs/>
+        </w:rPr>
+        <w:t xml:space="preserve"> </w:t>
+      </w:r>
+      <w:proofErr w:type="spellStart"/>
+      <w:proofErr w:type="gramStart"/>
+      <w:r>
+        <w:rPr>
+          <w:rFonts w:ascii="TH SarabunIT๙" w:hAnsi="TH SarabunIT๙" w:cs="TH SarabunIT๙"/>
+          <w:color w:val="000000" w:themeColor="text1"/>
+          <w:sz w:val="32"/>
+          <w:szCs w:val="32"/>
+          <w:cs/>
+        </w:rPr>
+        <w:t>ได้ประเมินผลการสอนรหัสวิชา</w:t>
+      </w:r>
+      <w:proofErr w:type="spellEnd"/>
       <w:r>
         <w:rPr>
           <w:rFonts w:ascii="TH Sarabun New" w:hAnsi="TH Sarabun New" w:cs="TH Sarabun New"/>
@@ -364,167 +383,230 @@
           <w:szCs w:val="32"/>
           <w:shd w:val="clear" w:color="auto" w:fill="FFFFFF"/>
         </w:rPr>
+        <w:t>{</w:t>
+      </w:r>
+      <w:proofErr w:type="gramEnd"/>
+      <w:r>
+        <w:rPr>
+          <w:rFonts w:ascii="TH Sarabun New" w:hAnsi="TH Sarabun New" w:cs="TH Sarabun New"/>
+          <w:color w:val="000000" w:themeColor="text1"/>
+          <w:sz w:val="32"/>
+          <w:szCs w:val="32"/>
+          <w:shd w:val="clear" w:color="auto" w:fill="FFFFFF"/>
+        </w:rPr>
+        <w:t>{</w:t>
+      </w:r>
+      <w:proofErr w:type="spellStart"/>
+      <w:r>
+        <w:rPr>
+          <w:rFonts w:ascii="TH Sarabun New" w:hAnsi="TH Sarabun New" w:cs="TH Sarabun New"/>
+          <w:color w:val="000000" w:themeColor="text1"/>
+          <w:sz w:val="32"/>
+          <w:szCs w:val="32"/>
+          <w:shd w:val="clear" w:color="auto" w:fill="FFFFFF"/>
+        </w:rPr>
+        <w:t>subject_</w:t>
+      </w:r>
+      <w:r>
+        <w:rPr>
+          <w:rFonts w:ascii="TH Sarabun New" w:hAnsi="TH Sarabun New" w:cs="TH Sarabun New"/>
+          <w:color w:val="000000" w:themeColor="text1"/>
+          <w:sz w:val="32"/>
+          <w:szCs w:val="32"/>
+          <w:shd w:val="clear" w:color="auto" w:fill="FFFFFF"/>
+        </w:rPr>
+        <w:t>code</w:t>
+      </w:r>
+      <w:proofErr w:type="spellEnd"/>
+      <w:r>
+        <w:rPr>
+          <w:rFonts w:ascii="TH Sarabun New" w:hAnsi="TH Sarabun New" w:cs="TH Sarabun New"/>
+          <w:color w:val="000000" w:themeColor="text1"/>
+          <w:sz w:val="32"/>
+          <w:szCs w:val="32"/>
+          <w:shd w:val="clear" w:color="auto" w:fill="FFFFFF"/>
+        </w:rPr>
+        <w:t xml:space="preserve">}} </w:t>
+      </w:r>
+      <w:proofErr w:type="gramStart"/>
+      <w:r>
+        <w:rPr>
+          <w:rFonts w:ascii="TH Sarabun New" w:hAnsi="TH Sarabun New" w:cs="TH Sarabun New" w:hint="cs"/>
+          <w:color w:val="000000" w:themeColor="text1"/>
+          <w:sz w:val="32"/>
+          <w:szCs w:val="32"/>
+          <w:shd w:val="clear" w:color="auto" w:fill="FFFFFF"/>
+          <w:cs/>
+          <w:lang w:bidi="th-TH"/>
+        </w:rPr>
+        <w:t>ร</w:t>
+      </w:r>
+      <w:proofErr w:type="spellStart"/>
+      <w:r>
+        <w:rPr>
+          <w:rFonts w:ascii="TH SarabunIT๙" w:hAnsi="TH SarabunIT๙" w:cs="TH SarabunIT๙"/>
+          <w:color w:val="000000" w:themeColor="text1"/>
+          <w:sz w:val="32"/>
+          <w:szCs w:val="32"/>
+          <w:cs/>
+        </w:rPr>
+        <w:t>ายวิชา</w:t>
+      </w:r>
+      <w:proofErr w:type="spellEnd"/>
+      <w:r>
+        <w:rPr>
+          <w:rFonts w:ascii="TH SarabunIT๙" w:hAnsi="TH SarabunIT๙" w:cs="TH SarabunIT๙" w:hint="cs"/>
+          <w:color w:val="000000" w:themeColor="text1"/>
+          <w:sz w:val="32"/>
+          <w:szCs w:val="32"/>
+          <w:cs/>
+          <w:lang w:bidi="th-TH"/>
+        </w:rPr>
+        <w:t xml:space="preserve">  </w:t>
+      </w:r>
+      <w:r>
+        <w:rPr>
+          <w:rFonts w:ascii="TH Sarabun New" w:hAnsi="TH Sarabun New" w:cs="TH Sarabun New"/>
+          <w:color w:val="000000" w:themeColor="text1"/>
+          <w:sz w:val="32"/>
+          <w:szCs w:val="32"/>
+          <w:shd w:val="clear" w:color="auto" w:fill="FFFFFF"/>
+        </w:rPr>
+        <w:t>{</w:t>
+      </w:r>
+      <w:proofErr w:type="gramEnd"/>
+      <w:r>
+        <w:rPr>
+          <w:rFonts w:ascii="TH Sarabun New" w:hAnsi="TH Sarabun New" w:cs="TH Sarabun New"/>
+          <w:color w:val="000000" w:themeColor="text1"/>
+          <w:sz w:val="32"/>
+          <w:szCs w:val="32"/>
+          <w:shd w:val="clear" w:color="auto" w:fill="FFFFFF"/>
+        </w:rPr>
+        <w:t>{</w:t>
+      </w:r>
+      <w:proofErr w:type="spellStart"/>
+      <w:r>
+        <w:rPr>
+          <w:rFonts w:ascii="TH Sarabun New" w:hAnsi="TH Sarabun New" w:cs="TH Sarabun New"/>
+          <w:color w:val="000000" w:themeColor="text1"/>
+          <w:sz w:val="32"/>
+          <w:szCs w:val="32"/>
+          <w:shd w:val="clear" w:color="auto" w:fill="FFFFFF"/>
+        </w:rPr>
+        <w:t>subject_name</w:t>
+      </w:r>
+      <w:proofErr w:type="spellEnd"/>
+      <w:r>
+        <w:rPr>
+          <w:rFonts w:ascii="TH Sarabun New" w:hAnsi="TH Sarabun New" w:cs="TH Sarabun New"/>
+          <w:color w:val="000000" w:themeColor="text1"/>
+          <w:sz w:val="32"/>
+          <w:szCs w:val="32"/>
+          <w:shd w:val="clear" w:color="auto" w:fill="FFFFFF"/>
+        </w:rPr>
+        <w:t>}}</w:t>
+      </w:r>
+      <w:r>
+        <w:rPr>
+          <w:rFonts w:ascii="TH Sarabun New" w:hAnsi="TH Sarabun New" w:cs="TH Sarabun New"/>
+          <w:color w:val="000000" w:themeColor="text1"/>
+          <w:sz w:val="32"/>
+          <w:szCs w:val="32"/>
+          <w:shd w:val="clear" w:color="auto" w:fill="FFFFFF"/>
+        </w:rPr>
+        <w:t> </w:t>
+      </w:r>
+      <w:proofErr w:type="spellStart"/>
+      <w:r>
+        <w:rPr>
+          <w:rFonts w:ascii="TH SarabunIT๙" w:hAnsi="TH SarabunIT๙" w:cs="TH SarabunIT๙"/>
+          <w:color w:val="000000" w:themeColor="text1"/>
+          <w:sz w:val="32"/>
+          <w:szCs w:val="32"/>
+          <w:cs/>
+        </w:rPr>
+        <w:t>ของ</w:t>
+      </w:r>
+      <w:proofErr w:type="spellEnd"/>
+      <w:r>
+        <w:rPr>
+          <w:rFonts w:ascii="TH SarabunIT๙" w:hAnsi="TH SarabunIT๙" w:cs="TH SarabunIT๙"/>
+          <w:color w:val="000000" w:themeColor="text1"/>
+          <w:sz w:val="32"/>
+          <w:szCs w:val="32"/>
+          <w:cs/>
+        </w:rPr>
+        <w:t xml:space="preserve"> </w:t>
+      </w:r>
+      <w:r>
+        <w:rPr>
+          <w:rFonts w:ascii="TH SarabunIT๙" w:hAnsi="TH SarabunIT๙" w:cs="TH SarabunIT๙"/>
+          <w:color w:val="000000" w:themeColor="text1"/>
+          <w:sz w:val="32"/>
+          <w:szCs w:val="32"/>
+          <w:lang w:bidi="th-TH"/>
+        </w:rPr>
         <w:t>{{</w:t>
       </w:r>
       <w:proofErr w:type="spellStart"/>
       <w:r>
         <w:rPr>
-          <w:rFonts w:ascii="TH Sarabun New" w:hAnsi="TH Sarabun New" w:cs="TH Sarabun New"/>
-          <w:color w:val="000000" w:themeColor="text1"/>
-          <w:sz w:val="32"/>
-          <w:szCs w:val="32"/>
-          <w:shd w:val="clear" w:color="auto" w:fill="FFFFFF"/>
-        </w:rPr>
-        <w:t>subject_</w:t>
-      </w:r>
-      <w:r>
-        <w:rPr>
-          <w:rFonts w:ascii="TH Sarabun New" w:hAnsi="TH Sarabun New" w:cs="TH Sarabun New"/>
-          <w:color w:val="000000" w:themeColor="text1"/>
-          <w:sz w:val="32"/>
-          <w:szCs w:val="32"/>
-          <w:shd w:val="clear" w:color="auto" w:fill="FFFFFF"/>
-        </w:rPr>
-        <w:t>code</w:t>
-      </w:r>
-      <w:proofErr w:type="spellEnd"/>
-      <w:r>
-        <w:rPr>
-          <w:rFonts w:ascii="TH Sarabun New" w:hAnsi="TH Sarabun New" w:cs="TH Sarabun New"/>
-          <w:color w:val="000000" w:themeColor="text1"/>
-          <w:sz w:val="32"/>
-          <w:szCs w:val="32"/>
-          <w:shd w:val="clear" w:color="auto" w:fill="FFFFFF"/>
-        </w:rPr>
-        <w:t xml:space="preserve">}} </w:t>
-      </w:r>
-      <w:r>
-        <w:rPr>
-          <w:rFonts w:ascii="TH Sarabun New" w:hAnsi="TH Sarabun New" w:cs="TH Sarabun New" w:hint="cs"/>
-          <w:color w:val="000000" w:themeColor="text1"/>
-          <w:sz w:val="32"/>
-          <w:szCs w:val="32"/>
-          <w:shd w:val="clear" w:color="auto" w:fill="FFFFFF"/>
-          <w:cs/>
-          <w:lang w:bidi="th-TH"/>
-        </w:rPr>
-        <w:t>ร</w:t>
-      </w:r>
-      <w:r>
-        <w:rPr>
-          <w:rFonts w:ascii="TH SarabunIT๙" w:hAnsi="TH SarabunIT๙" w:cs="TH SarabunIT๙"/>
-          <w:color w:val="000000" w:themeColor="text1"/>
-          <w:sz w:val="32"/>
-          <w:szCs w:val="32"/>
-          <w:cs/>
-        </w:rPr>
-        <w:t>ายวิชา</w:t>
-      </w:r>
-      <w:r>
-        <w:rPr>
-          <w:rFonts w:ascii="TH SarabunIT๙" w:hAnsi="TH SarabunIT๙" w:cs="TH SarabunIT๙" w:hint="cs"/>
-          <w:color w:val="000000" w:themeColor="text1"/>
-          <w:sz w:val="32"/>
-          <w:szCs w:val="32"/>
-          <w:cs/>
-          <w:lang w:bidi="th-TH"/>
-        </w:rPr>
-        <w:t xml:space="preserve">  </w:t>
-      </w:r>
-      <w:r>
-        <w:rPr>
-          <w:rFonts w:ascii="TH Sarabun New" w:hAnsi="TH Sarabun New" w:cs="TH Sarabun New"/>
-          <w:color w:val="000000" w:themeColor="text1"/>
-          <w:sz w:val="32"/>
-          <w:szCs w:val="32"/>
-          <w:shd w:val="clear" w:color="auto" w:fill="FFFFFF"/>
-        </w:rPr>
-        <w:t>{{</w:t>
-      </w:r>
-      <w:proofErr w:type="spellStart"/>
-      <w:r>
-        <w:rPr>
-          <w:rFonts w:ascii="TH Sarabun New" w:hAnsi="TH Sarabun New" w:cs="TH Sarabun New"/>
-          <w:color w:val="000000" w:themeColor="text1"/>
-          <w:sz w:val="32"/>
-          <w:szCs w:val="32"/>
-          <w:shd w:val="clear" w:color="auto" w:fill="FFFFFF"/>
-        </w:rPr>
-        <w:t>subject_name</w:t>
-      </w:r>
-      <w:proofErr w:type="spellEnd"/>
-      <w:r>
-        <w:rPr>
-          <w:rFonts w:ascii="TH Sarabun New" w:hAnsi="TH Sarabun New" w:cs="TH Sarabun New"/>
-          <w:color w:val="000000" w:themeColor="text1"/>
-          <w:sz w:val="32"/>
-          <w:szCs w:val="32"/>
-          <w:shd w:val="clear" w:color="auto" w:fill="FFFFFF"/>
+          <w:rFonts w:ascii="TH SarabunIT๙" w:hAnsi="TH SarabunIT๙" w:cs="TH SarabunIT๙"/>
+          <w:color w:val="000000" w:themeColor="text1"/>
+          <w:sz w:val="32"/>
+          <w:szCs w:val="32"/>
+          <w:lang w:bidi="th-TH"/>
+        </w:rPr>
+        <w:t>applicant_name</w:t>
+      </w:r>
+      <w:proofErr w:type="spellEnd"/>
+      <w:proofErr w:type="gramStart"/>
+      <w:r>
+        <w:rPr>
+          <w:rFonts w:ascii="TH SarabunIT๙" w:hAnsi="TH SarabunIT๙" w:cs="TH SarabunIT๙"/>
+          <w:color w:val="000000" w:themeColor="text1"/>
+          <w:sz w:val="32"/>
+          <w:szCs w:val="32"/>
+          <w:lang w:bidi="th-TH"/>
         </w:rPr>
         <w:t>}}</w:t>
       </w:r>
-      <w:r>
-        <w:rPr>
-          <w:rFonts w:ascii="TH Sarabun New" w:hAnsi="TH Sarabun New" w:cs="TH Sarabun New"/>
-          <w:color w:val="000000" w:themeColor="text1"/>
-          <w:sz w:val="32"/>
-          <w:szCs w:val="32"/>
-          <w:shd w:val="clear" w:color="auto" w:fill="FFFFFF"/>
-        </w:rPr>
-        <w:t> </w:t>
-      </w:r>
-      <w:r>
-        <w:rPr>
-          <w:rFonts w:ascii="TH SarabunIT๙" w:hAnsi="TH SarabunIT๙" w:cs="TH SarabunIT๙"/>
-          <w:color w:val="000000" w:themeColor="text1"/>
-          <w:sz w:val="32"/>
-          <w:szCs w:val="32"/>
-          <w:cs/>
-        </w:rPr>
-        <w:t xml:space="preserve">ของ </w:t>
-      </w:r>
-      <w:r>
-        <w:rPr>
-          <w:rFonts w:ascii="TH SarabunIT๙" w:hAnsi="TH SarabunIT๙" w:cs="TH SarabunIT๙"/>
-          <w:color w:val="000000" w:themeColor="text1"/>
-          <w:sz w:val="32"/>
-          <w:szCs w:val="32"/>
-          <w:lang w:bidi="th-TH"/>
-        </w:rPr>
-        <w:t>{{</w:t>
-      </w:r>
-      <w:proofErr w:type="spellStart"/>
-      <w:r>
-        <w:rPr>
-          <w:rFonts w:ascii="TH SarabunIT๙" w:hAnsi="TH SarabunIT๙" w:cs="TH SarabunIT๙"/>
-          <w:color w:val="000000" w:themeColor="text1"/>
-          <w:sz w:val="32"/>
-          <w:szCs w:val="32"/>
-          <w:lang w:bidi="th-TH"/>
-        </w:rPr>
-        <w:t>applicant_name</w:t>
-      </w:r>
-      <w:proofErr w:type="spellEnd"/>
-      <w:r>
-        <w:rPr>
-          <w:rFonts w:ascii="TH SarabunIT๙" w:hAnsi="TH SarabunIT๙" w:cs="TH SarabunIT๙"/>
-          <w:color w:val="000000" w:themeColor="text1"/>
-          <w:sz w:val="32"/>
-          <w:szCs w:val="32"/>
-          <w:lang w:bidi="th-TH"/>
-        </w:rPr>
-        <w:t>}}</w:t>
-      </w:r>
-      <w:r>
-        <w:rPr>
-          <w:rFonts w:ascii="TH SarabunIT๙" w:hAnsi="TH SarabunIT๙" w:cs="TH SarabunIT๙"/>
-          <w:color w:val="000000" w:themeColor="text1"/>
-          <w:sz w:val="32"/>
-          <w:szCs w:val="32"/>
-          <w:cs/>
-        </w:rPr>
-        <w:t>แล้วเห็นว่า บุคคลดังกล่าวเป็นผู้มีความ</w:t>
-      </w:r>
+      <w:proofErr w:type="spellStart"/>
+      <w:r>
+        <w:rPr>
+          <w:rFonts w:ascii="TH SarabunIT๙" w:hAnsi="TH SarabunIT๙" w:cs="TH SarabunIT๙"/>
+          <w:color w:val="000000" w:themeColor="text1"/>
+          <w:sz w:val="32"/>
+          <w:szCs w:val="32"/>
+          <w:cs/>
+        </w:rPr>
+        <w:t>แล้วเห็นว่า</w:t>
+      </w:r>
+      <w:proofErr w:type="spellEnd"/>
+      <w:proofErr w:type="gramEnd"/>
+      <w:r>
+        <w:rPr>
+          <w:rFonts w:ascii="TH SarabunIT๙" w:hAnsi="TH SarabunIT๙" w:cs="TH SarabunIT๙"/>
+          <w:color w:val="000000" w:themeColor="text1"/>
+          <w:sz w:val="32"/>
+          <w:szCs w:val="32"/>
+          <w:cs/>
+        </w:rPr>
+        <w:t xml:space="preserve"> </w:t>
+      </w:r>
+      <w:proofErr w:type="spellStart"/>
+      <w:r>
+        <w:rPr>
+          <w:rFonts w:ascii="TH SarabunIT๙" w:hAnsi="TH SarabunIT๙" w:cs="TH SarabunIT๙"/>
+          <w:color w:val="000000" w:themeColor="text1"/>
+          <w:sz w:val="32"/>
+          <w:szCs w:val="32"/>
+          <w:cs/>
+        </w:rPr>
+        <w:t>บุคคลดังกล่าวเป็นผู้มีความ</w:t>
+      </w:r>
+      <w:proofErr w:type="spellEnd"/>
     </w:p>
     <w:p>
       <w:pPr>
@@ -613,48 +695,6 @@
           <w:lang w:bidi="th-TH"/>
         </w:rPr>
         <w:t>)</w:t>
-      </w:r>
-      <w:r>
-        <w:rPr>
-          <w:rFonts w:ascii="TH Sarabun New" w:hAnsi="TH Sarabun New" w:cs="TH Sarabun New"/>
-          <w:color w:val="000000" w:themeColor="text1"/>
-          <w:sz w:val="32"/>
-          <w:szCs w:val="32"/>
-          <w:lang w:bidi="th-TH"/>
-        </w:rPr>
-        <w:t xml:space="preserve"> </w:t>
-      </w:r>
-      <w:r>
-        <w:rPr>
-          <w:rFonts w:ascii="TH Sarabun New" w:hAnsi="TH Sarabun New" w:cs="TH Sarabun New"/>
-          <w:color w:val="000000" w:themeColor="text1"/>
-          <w:sz w:val="32"/>
-          <w:szCs w:val="32"/>
-          <w:cs/>
-          <w:lang w:bidi="th-TH"/>
-        </w:rPr>
-        <w:t xml:space="preserve"> </w:t>
-      </w:r>
-      <w:r>
-        <w:rPr>
-          <w:rFonts w:ascii="TH Sarabun New" w:hAnsi="TH Sarabun New" w:cs="TH Sarabun New"/>
-          <w:color w:val="000000" w:themeColor="text1"/>
-          <w:sz w:val="32"/>
-          <w:szCs w:val="32"/>
-          <w:lang w:bidi="th-TH"/>
-        </w:rPr>
-        <w:t xml:space="preserve">    </w:t>
-      </w:r>
-      <w:r>
-        <w:rPr>
-          <w:rFonts w:ascii="TH Sarabun New" w:hAnsi="TH Sarabun New" w:cs="TH Sarabun New"/>
-          <w:color w:val="000000" w:themeColor="text1"/>
-          <w:sz w:val="32"/>
-          <w:szCs w:val="32"/>
-          <w:cs/>
-          <w:lang w:bidi="th-TH"/>
-        </w:rPr>
-        <w:t xml:space="preserve"> </w:t>
       </w:r>
       <w:r>
         <w:rPr>
@@ -1049,6 +1089,7 @@
           <w:szCs w:val="32"/>
         </w:rPr>
       </w:pPr>
+      <w:proofErr w:type="gramStart"/>
       <w:r>
         <w:rPr>
           <w:rFonts w:ascii="TH SarabunIT๙" w:hAnsi="TH SarabunIT๙" w:cs="TH SarabunIT๙"/>
@@ -1078,6 +1119,85 @@
           <w:szCs w:val="32"/>
           <w:lang w:bidi="th-TH"/>
         </w:rPr>
+        <w:t>{</w:t>
+      </w:r>
+      <w:proofErr w:type="gramEnd"/>
+      <w:r>
+        <w:rPr>
+          <w:rFonts w:ascii="TH Sarabun New" w:hAnsi="TH Sarabun New" w:cs="TH Sarabun New"/>
+          <w:color w:val="000000" w:themeColor="text1"/>
+          <w:sz w:val="32"/>
+          <w:szCs w:val="32"/>
+          <w:lang w:bidi="th-TH"/>
+        </w:rPr>
+        <w:t>{</w:t>
+      </w:r>
+      <w:proofErr w:type="spellStart"/>
+      <w:r>
+        <w:rPr>
+          <w:rFonts w:ascii="TH Sarabun New" w:hAnsi="TH Sarabun New" w:cs="TH Sarabun New"/>
+          <w:color w:val="000000" w:themeColor="text1"/>
+          <w:sz w:val="32"/>
+          <w:szCs w:val="32"/>
+          <w:lang w:bidi="th-TH"/>
+        </w:rPr>
+        <w:t>signed_day</w:t>
+      </w:r>
+      <w:proofErr w:type="spellEnd"/>
+      <w:proofErr w:type="gramStart"/>
+      <w:r>
+        <w:rPr>
+          <w:rFonts w:ascii="TH Sarabun New" w:hAnsi="TH Sarabun New" w:cs="TH Sarabun New"/>
+          <w:color w:val="000000" w:themeColor="text1"/>
+          <w:sz w:val="32"/>
+          <w:szCs w:val="32"/>
+          <w:lang w:bidi="th-TH"/>
+        </w:rPr>
+        <w:t>}}</w:t>
+      </w:r>
+      <w:r>
+        <w:rPr>
+          <w:rFonts w:ascii="TH SarabunIT๙" w:hAnsi="TH SarabunIT๙" w:cs="TH SarabunIT๙" w:hint="cs"/>
+          <w:color w:val="000000" w:themeColor="text1"/>
+          <w:sz w:val="32"/>
+          <w:szCs w:val="32"/>
+          <w:cs/>
+          <w:lang w:bidi="th-TH"/>
+        </w:rPr>
+        <w:t xml:space="preserve">  </w:t>
+      </w:r>
+      <w:proofErr w:type="spellStart"/>
+      <w:r>
+        <w:rPr>
+          <w:rFonts w:ascii="TH SarabunIT๙" w:hAnsi="TH SarabunIT๙" w:cs="TH SarabunIT๙"/>
+          <w:color w:val="000000" w:themeColor="text1"/>
+          <w:sz w:val="32"/>
+          <w:szCs w:val="32"/>
+          <w:cs/>
+        </w:rPr>
+        <w:t>เดือน</w:t>
+      </w:r>
+      <w:proofErr w:type="spellEnd"/>
+      <w:proofErr w:type="gramEnd"/>
+      <w:r>
+        <w:rPr>
+          <w:rFonts w:ascii="TH SarabunIT๙" w:hAnsi="TH SarabunIT๙" w:cs="TH SarabunIT๙" w:hint="cs"/>
+          <w:color w:val="000000" w:themeColor="text1"/>
+          <w:sz w:val="32"/>
+          <w:szCs w:val="32"/>
+          <w:cs/>
+          <w:lang w:bidi="th-TH"/>
+        </w:rPr>
+        <w:t xml:space="preserve">  </w:t>
+      </w:r>
+      <w:r>
+        <w:rPr>
+          <w:rFonts w:ascii="TH Sarabun New" w:hAnsi="TH Sarabun New" w:cs="TH Sarabun New"/>
+          <w:color w:val="000000" w:themeColor="text1"/>
+          <w:sz w:val="32"/>
+          <w:szCs w:val="32"/>
+          <w:lang w:bidi="th-TH"/>
+        </w:rPr>
         <w:t>{{</w:t>
       </w:r>
       <w:proofErr w:type="spellStart"/>
@@ -1089,9 +1209,10 @@
           <w:szCs w:val="32"/>
           <w:lang w:bidi="th-TH"/>
         </w:rPr>
-        <w:t>signed_day</w:t>
-      </w:r>
-      <w:proofErr w:type="spellEnd"/>
+        <w:t>signed_month</w:t>
+      </w:r>
+      <w:proofErr w:type="spellEnd"/>
+      <w:proofErr w:type="gramStart"/>
       <w:r>
         <w:rPr>
           <w:rFonts w:ascii="TH Sarabun New" w:hAnsi="TH Sarabun New" w:cs="TH Sarabun New"/>
@@ -1115,16 +1236,6 @@
       </w:r>
       <w:r>
         <w:rPr>
-          <w:rFonts w:ascii="TH SarabunIT๙" w:hAnsi="TH SarabunIT๙" w:cs="TH SarabunIT๙"/>
-          <w:color w:val="000000" w:themeColor="text1"/>
-          <w:sz w:val="32"/>
-          <w:szCs w:val="32"/>
-          <w:cs/>
-        </w:rPr>
-        <w:t>เดือน</w:t>
-      </w:r>
-      <w:r>
-        <w:rPr>
           <w:rFonts w:ascii="TH SarabunIT๙" w:hAnsi="TH SarabunIT๙" w:cs="TH SarabunIT๙" w:hint="cs"/>
           <w:color w:val="000000" w:themeColor="text1"/>
           <w:sz w:val="32"/>
@@ -1132,40 +1243,9 @@
           <w:cs/>
           <w:lang w:bidi="th-TH"/>
         </w:rPr>
-        <w:t xml:space="preserve">  </w:t>
-      </w:r>
-      <w:r>
-        <w:rPr>
-          <w:rFonts w:ascii="TH Sarabun New" w:hAnsi="TH Sarabun New" w:cs="TH Sarabun New"/>
-          <w:color w:val="000000" w:themeColor="text1"/>
-          <w:sz w:val="32"/>
-          <w:szCs w:val="32"/>
-          <w:lang w:bidi="th-TH"/>
-        </w:rPr>
-        <w:t>{{</w:t>
-      </w:r>
-      <w:proofErr w:type="spellStart"/>
-      <w:r>
-        <w:rPr>
-          <w:rFonts w:ascii="TH Sarabun New" w:hAnsi="TH Sarabun New" w:cs="TH Sarabun New"/>
-          <w:color w:val="000000" w:themeColor="text1"/>
-          <w:sz w:val="32"/>
-          <w:szCs w:val="32"/>
-          <w:lang w:bidi="th-TH"/>
-        </w:rPr>
-        <w:t>signed_month</w:t>
-      </w:r>
-      <w:proofErr w:type="spellEnd"/>
-      <w:r>
-        <w:rPr>
-          <w:rFonts w:ascii="TH Sarabun New" w:hAnsi="TH Sarabun New" w:cs="TH Sarabun New"/>
-          <w:color w:val="000000" w:themeColor="text1"/>
-          <w:sz w:val="32"/>
-          <w:szCs w:val="32"/>
-          <w:lang w:bidi="th-TH"/>
-        </w:rPr>
-        <w:t>}}</w:t>
-      </w:r>
+        <w:t xml:space="preserve"> </w:t>
+      </w:r>
+      <w:proofErr w:type="gramEnd"/>
       <w:r>
         <w:rPr>
           <w:rFonts w:ascii="TH SarabunIT๙" w:hAnsi="TH SarabunIT๙" w:cs="TH SarabunIT๙" w:hint="cs"/>
@@ -1175,28 +1255,29 @@
           <w:cs/>
           <w:lang w:bidi="th-TH"/>
         </w:rPr>
-        <w:t xml:space="preserve">  </w:t>
-      </w:r>
-      <w:r>
-        <w:rPr>
-          <w:rFonts w:ascii="TH SarabunIT๙" w:hAnsi="TH SarabunIT๙" w:cs="TH SarabunIT๙" w:hint="cs"/>
-          <w:color w:val="000000" w:themeColor="text1"/>
-          <w:sz w:val="32"/>
-          <w:szCs w:val="32"/>
-          <w:cs/>
-          <w:lang w:bidi="th-TH"/>
-        </w:rPr>
-        <w:t xml:space="preserve">  </w:t>
-      </w:r>
-      <w:r>
-        <w:rPr>
-          <w:rFonts w:ascii="TH SarabunIT๙" w:hAnsi="TH SarabunIT๙" w:cs="TH SarabunIT๙"/>
-          <w:color w:val="000000" w:themeColor="text1"/>
-          <w:sz w:val="32"/>
-          <w:szCs w:val="32"/>
-          <w:cs/>
-        </w:rPr>
-        <w:t>พ.ศ.</w:t>
+        <w:t xml:space="preserve"> </w:t>
+      </w:r>
+      <w:proofErr w:type="spellStart"/>
+      <w:r>
+        <w:rPr>
+          <w:rFonts w:ascii="TH SarabunIT๙" w:hAnsi="TH SarabunIT๙" w:cs="TH SarabunIT๙"/>
+          <w:color w:val="000000" w:themeColor="text1"/>
+          <w:sz w:val="32"/>
+          <w:szCs w:val="32"/>
+          <w:cs/>
+        </w:rPr>
+        <w:t>พ.ศ</w:t>
+      </w:r>
+      <w:proofErr w:type="spellEnd"/>
+      <w:r>
+        <w:rPr>
+          <w:rFonts w:ascii="TH SarabunIT๙" w:hAnsi="TH SarabunIT๙" w:cs="TH SarabunIT๙"/>
+          <w:color w:val="000000" w:themeColor="text1"/>
+          <w:sz w:val="32"/>
+          <w:szCs w:val="32"/>
+          <w:cs/>
+        </w:rPr>
+        <w:t>.</w:t>
       </w:r>
       <w:r>
         <w:rPr>
@@ -1684,16 +1765,17 @@
     <w:lsdException w:name="Unresolved Mention" w:semiHidden="1" w:unhideWhenUsed="1"/>
     <w:lsdException w:name="Smart Link" w:semiHidden="1" w:unhideWhenUsed="1"/>
   </w:latentStyles>
-  <w:style w:type="paragraph" w:default="1" w:styleId="a">
+  <w:style w:type="paragraph" w:default="1" w:styleId="Normal">
     <w:name w:val="Normal"/>
     <w:qFormat/>
   </w:style>
-  <w:style w:type="character" w:default="1" w:styleId="a0">
+  <w:style w:type="character" w:default="1" w:styleId="DefaultParagraphFont">
     <w:name w:val="Default Paragraph Font"/>
     <w:uiPriority w:val="1"/>
+    <w:semiHidden/>
     <w:unhideWhenUsed/>
   </w:style>
-  <w:style w:type="table" w:default="1" w:styleId="a1">
+  <w:style w:type="table" w:default="1" w:styleId="TableNormal">
     <w:name w:val="Normal Table"/>
     <w:uiPriority w:val="99"/>
     <w:semiHidden/>
@@ -1708,7 +1790,7 @@
       </w:tblCellMar>
     </w:tblPr>
   </w:style>
-  <w:style w:type="numbering" w:default="1" w:styleId="a2">
+  <w:style w:type="numbering" w:default="1" w:styleId="NoList">
     <w:name w:val="No List"/>
     <w:uiPriority w:val="99"/>
     <w:semiHidden/>

</xml_diff>

<commit_message>
Add DOCX uploads and update template
Update template docx and add multiple uploaded documents. Modified: src/main/resources/templates/docx/doc_7.docx. Added: src/main/resources/templates/docx/~$doc_7.docx (editor temp file), and uploads/academic/2/{doc_0.docx, doc_4_copy_1.docx, doc_4_copy_2.docx, doc_4_copy_3.docx, doc_7.docx, doc_8.docx}. These are binary DOCX assets for templates/uploads; consider ignoring editor temp files (~$*) in .gitignore to avoid accidental commits.
</commit_message>
<xml_diff>
--- a/shopping-cart-spring-boot-main/src/main/resources/templates/docx/doc_7.docx
+++ b/shopping-cart-spring-boot-main/src/main/resources/templates/docx/doc_7.docx
@@ -6,7 +6,7 @@
       <w:pPr>
         <w:spacing w:after="0" w:line="240" w:lineRule="auto"/>
         <w:rPr>
-          <w:rFonts w:ascii="TH SarabunIT๙" w:hAnsi="TH SarabunIT๙" w:cs="TH SarabunIT๙"/>
+          <w:rFonts w:ascii="TH Sarabun New" w:hAnsi="TH Sarabun New" w:cs="TH Sarabun New"/>
           <w:b/>
           <w:bCs/>
           <w:color w:val="000000" w:themeColor="text1"/>
@@ -16,7 +16,7 @@
       </w:pPr>
       <w:r>
         <w:rPr>
-          <w:rFonts w:ascii="TH SarabunIT๙" w:hAnsi="TH SarabunIT๙" w:cs="TH SarabunIT๙"/>
+          <w:rFonts w:ascii="TH Sarabun New" w:hAnsi="TH Sarabun New" w:cs="TH Sarabun New"/>
           <w:b/>
           <w:bCs/>
           <w:color w:val="000000" w:themeColor="text1"/>
@@ -24,35 +24,11 @@
           <w:szCs w:val="32"/>
           <w:cs/>
         </w:rPr>
-        <w:t>ส่วนที่</w:t>
-      </w:r>
-      <w:r>
-        <w:rPr>
-          <w:rFonts w:ascii="TH SarabunIT๙" w:hAnsi="TH SarabunIT๙" w:cs="TH SarabunIT๙" w:hint="cs"/>
-          <w:b/>
-          <w:bCs/>
-          <w:color w:val="000000" w:themeColor="text1"/>
-          <w:sz w:val="32"/>
-          <w:szCs w:val="32"/>
-          <w:cs/>
-        </w:rPr>
-        <w:t xml:space="preserve"> </w:t>
-      </w:r>
-      <w:r>
-        <w:rPr>
-          <w:rFonts w:ascii="TH SarabunIT๙" w:hAnsi="TH SarabunIT๙" w:cs="TH SarabunIT๙"/>
-          <w:b/>
-          <w:bCs/>
-          <w:color w:val="000000" w:themeColor="text1"/>
-          <w:sz w:val="32"/>
-          <w:szCs w:val="32"/>
-          <w:cs/>
-        </w:rPr>
-        <w:t>๓</w:t>
-      </w:r>
-      <w:r>
-        <w:rPr>
-          <w:rFonts w:ascii="TH SarabunIT๙" w:hAnsi="TH SarabunIT๙" w:cs="TH SarabunIT๙"/>
+        <w:t>ส่วนที่ ๓</w:t>
+      </w:r>
+      <w:r>
+        <w:rPr>
+          <w:rFonts w:ascii="TH Sarabun New" w:hAnsi="TH Sarabun New" w:cs="TH Sarabun New"/>
           <w:b/>
           <w:bCs/>
           <w:color w:val="000000" w:themeColor="text1"/>
@@ -69,7 +45,7 @@
         <w:spacing w:after="0" w:line="240" w:lineRule="auto"/>
         <w:jc w:val="thaiDistribute"/>
         <w:rPr>
-          <w:rFonts w:ascii="TH SarabunIT๙" w:hAnsi="TH SarabunIT๙" w:cs="TH SarabunIT๙"/>
+          <w:rFonts w:ascii="TH Sarabun New" w:hAnsi="TH Sarabun New" w:cs="TH Sarabun New"/>
           <w:color w:val="000000" w:themeColor="text1"/>
           <w:sz w:val="32"/>
           <w:szCs w:val="32"/>
@@ -77,7 +53,7 @@
       </w:pPr>
       <w:r>
         <w:rPr>
-          <w:rFonts w:ascii="TH SarabunIT๙" w:hAnsi="TH SarabunIT๙" w:cs="TH SarabunIT๙"/>
+          <w:rFonts w:ascii="TH Sarabun New" w:hAnsi="TH Sarabun New" w:cs="TH Sarabun New"/>
           <w:color w:val="000000" w:themeColor="text1"/>
           <w:sz w:val="32"/>
           <w:szCs w:val="32"/>
@@ -87,198 +63,248 @@
       </w:r>
       <w:r>
         <w:rPr>
-          <w:rFonts w:ascii="TH SarabunIT๙" w:hAnsi="TH SarabunIT๙" w:cs="TH SarabunIT๙"/>
+          <w:rFonts w:ascii="TH Sarabun New" w:hAnsi="TH Sarabun New" w:cs="TH Sarabun New"/>
           <w:color w:val="000000" w:themeColor="text1"/>
           <w:sz w:val="32"/>
           <w:szCs w:val="32"/>
           <w:cs/>
         </w:rPr>
         <w:tab/>
-        <w:t>คณะอนุกรรมการเพื่อประเมินผลการสอน</w:t>
-      </w:r>
-      <w:r>
-        <w:rPr>
-          <w:rFonts w:ascii="TH SarabunIT๙" w:hAnsi="TH SarabunIT๙" w:cs="TH SarabunIT๙" w:hint="cs"/>
-          <w:color w:val="000000" w:themeColor="text1"/>
-          <w:sz w:val="32"/>
-          <w:szCs w:val="32"/>
-          <w:cs/>
+        <w:t>คณะอนุกรรมการเพื่อประเมินผลการสอน ในการประชุมครั้งที่</w:t>
+      </w:r>
+      <w:r>
+        <w:rPr>
+          <w:rFonts w:ascii="TH Sarabun New" w:hAnsi="TH Sarabun New" w:cs="TH Sarabun New"/>
+          <w:color w:val="000000" w:themeColor="text1"/>
+          <w:sz w:val="32"/>
+          <w:szCs w:val="32"/>
         </w:rPr>
         <w:t xml:space="preserve"> </w:t>
       </w:r>
       <w:r>
         <w:rPr>
-          <w:rFonts w:ascii="TH SarabunIT๙" w:hAnsi="TH SarabunIT๙" w:cs="TH SarabunIT๙"/>
-          <w:color w:val="000000" w:themeColor="text1"/>
-          <w:sz w:val="32"/>
-          <w:szCs w:val="32"/>
-          <w:cs/>
-        </w:rPr>
-        <w:t>ในการประชุมครั้งที่</w:t>
-      </w:r>
-      <w:r>
-        <w:rPr>
-          <w:rFonts w:ascii="TH SarabunIT๙" w:hAnsi="TH SarabunIT๙" w:cs="TH SarabunIT๙"/>
+          <w:rFonts w:ascii="TH Sarabun New" w:hAnsi="TH Sarabun New" w:cs="TH Sarabun New"/>
+          <w:color w:val="000000" w:themeColor="text1"/>
+          <w:sz w:val="32"/>
+          <w:szCs w:val="32"/>
+          <w:lang w:bidi="th-TH"/>
+        </w:rPr>
+        <w:t>{{</w:t>
+      </w:r>
+      <w:r>
+        <w:rPr>
+          <w:rFonts w:ascii="TH Sarabun New" w:hAnsi="TH Sarabun New" w:cs="TH Sarabun New"/>
+          <w:color w:val="000000" w:themeColor="text1"/>
+          <w:sz w:val="32"/>
+          <w:szCs w:val="32"/>
+          <w:lang w:bidi="th-TH"/>
+        </w:rPr>
+        <w:t>meeting_no</w:t>
+      </w:r>
+      <w:r>
+        <w:rPr>
+          <w:rFonts w:ascii="TH Sarabun New" w:hAnsi="TH Sarabun New" w:cs="TH Sarabun New"/>
+          <w:color w:val="000000" w:themeColor="text1"/>
+          <w:sz w:val="32"/>
+          <w:szCs w:val="32"/>
+          <w:lang w:bidi="th-TH"/>
+        </w:rPr>
+        <w:t>}}</w:t>
+      </w:r>
+      <w:r>
+        <w:rPr>
+          <w:rFonts w:ascii="TH Sarabun New" w:hAnsi="TH Sarabun New" w:cs="TH Sarabun New"/>
           <w:color w:val="000000" w:themeColor="text1"/>
           <w:sz w:val="32"/>
           <w:szCs w:val="32"/>
         </w:rPr>
         <w:t xml:space="preserve"> </w:t>
       </w:r>
-      <w:r>
-        <w:rPr>
-          <w:rFonts w:ascii="TH SarabunIT๙" w:hAnsi="TH SarabunIT๙" w:cs="TH SarabunIT๙"/>
-          <w:color w:val="000000" w:themeColor="text1"/>
-          <w:sz w:val="32"/>
-          <w:szCs w:val="32"/>
-          <w:lang w:bidi="th-TH"/>
+      <w:proofErr w:type="spellStart"/>
+      <w:r>
+        <w:rPr>
+          <w:rFonts w:ascii="TH Sarabun New" w:hAnsi="TH Sarabun New" w:cs="TH Sarabun New"/>
+          <w:color w:val="000000" w:themeColor="text1"/>
+          <w:sz w:val="32"/>
+          <w:szCs w:val="32"/>
+          <w:cs/>
+        </w:rPr>
+        <w:t>เมื่อวันที่</w:t>
+      </w:r>
+      <w:proofErr w:type="spellEnd"/>
+      <w:r>
+        <w:rPr>
+          <w:rFonts w:ascii="TH Sarabun New" w:hAnsi="TH Sarabun New" w:cs="TH Sarabun New"/>
+          <w:color w:val="000000" w:themeColor="text1"/>
+          <w:sz w:val="32"/>
+          <w:szCs w:val="32"/>
+        </w:rPr>
+        <w:t xml:space="preserve"> </w:t>
+      </w:r>
+      <w:r>
+        <w:rPr>
+          <w:rFonts w:ascii="TH Sarabun New" w:hAnsi="TH Sarabun New" w:cs="TH Sarabun New"/>
+          <w:color w:val="000000" w:themeColor="text1"/>
+          <w:sz w:val="32"/>
+          <w:szCs w:val="32"/>
+          <w:lang w:bidi="th-TH"/>
+        </w:rPr>
+        <w:t>{{meet</w:t>
+      </w:r>
+      <w:r>
+        <w:rPr>
+          <w:rFonts w:ascii="TH Sarabun New" w:hAnsi="TH Sarabun New" w:cs="TH Sarabun New"/>
+          <w:color w:val="000000" w:themeColor="text1"/>
+          <w:sz w:val="32"/>
+          <w:szCs w:val="32"/>
+          <w:lang w:bidi="th-TH"/>
+        </w:rPr>
+        <w:t>ing_da</w:t>
+      </w:r>
+      <w:r>
+        <w:rPr>
+          <w:rFonts w:ascii="TH Sarabun New" w:hAnsi="TH Sarabun New" w:cs="TH Sarabun New"/>
+          <w:color w:val="000000" w:themeColor="text1"/>
+          <w:sz w:val="32"/>
+          <w:szCs w:val="32"/>
+          <w:lang w:bidi="th-TH"/>
+        </w:rPr>
+        <w:t>te</w:t>
+      </w:r>
+      <w:r>
+        <w:rPr>
+          <w:rFonts w:ascii="TH Sarabun New" w:hAnsi="TH Sarabun New" w:cs="TH Sarabun New"/>
+          <w:color w:val="000000" w:themeColor="text1"/>
+          <w:sz w:val="32"/>
+          <w:szCs w:val="32"/>
+          <w:lang w:bidi="th-TH"/>
+        </w:rPr>
+        <w:t>}}</w:t>
+      </w:r>
+      <w:r>
+        <w:rPr>
+          <w:rFonts w:ascii="TH Sarabun New" w:hAnsi="TH Sarabun New" w:cs="TH Sarabun New"/>
+          <w:color w:val="000000" w:themeColor="text1"/>
+          <w:sz w:val="32"/>
+          <w:szCs w:val="32"/>
+          <w:cs/>
+          <w:lang w:bidi="th-TH"/>
+        </w:rPr>
+        <w:t xml:space="preserve">  </w:t>
+      </w:r>
+      <w:r>
+        <w:rPr>
+          <w:rFonts w:ascii="TH Sarabun New" w:hAnsi="TH Sarabun New" w:cs="TH Sarabun New"/>
+          <w:color w:val="000000" w:themeColor="text1"/>
+          <w:sz w:val="32"/>
+          <w:szCs w:val="32"/>
+          <w:cs/>
+        </w:rPr>
+        <w:t>ซึ่งได้รับมอบอำนาจจากคณะกรรมการพิจารณาตำแหน่งทางวิชาการ</w:t>
+      </w:r>
+      <w:r>
+        <w:rPr>
+          <w:rFonts w:ascii="TH Sarabun New" w:hAnsi="TH Sarabun New" w:cs="TH Sarabun New"/>
+          <w:color w:val="000000" w:themeColor="text1"/>
+          <w:sz w:val="32"/>
+          <w:szCs w:val="32"/>
+          <w:cs/>
+          <w:lang w:bidi="th-TH"/>
+        </w:rPr>
+        <w:t>มหาวิทยาลัยขอนแก่น</w:t>
+      </w:r>
+      <w:r>
+        <w:rPr>
+          <w:rFonts w:ascii="TH Sarabun New" w:hAnsi="TH Sarabun New" w:cs="TH Sarabun New"/>
+          <w:color w:val="000000" w:themeColor="text1"/>
+          <w:sz w:val="32"/>
+          <w:szCs w:val="32"/>
+          <w:cs/>
+        </w:rPr>
+        <w:t xml:space="preserve"> ได้ประเมินผลการสอนรหัสวิชา</w:t>
+      </w:r>
+      <w:r>
+        <w:rPr>
+          <w:rFonts w:ascii="TH Sarabun New" w:hAnsi="TH Sarabun New" w:cs="TH Sarabun New"/>
+          <w:color w:val="000000" w:themeColor="text1"/>
+          <w:sz w:val="32"/>
+          <w:szCs w:val="32"/>
+          <w:shd w:val="clear" w:color="auto" w:fill="FFFFFF"/>
         </w:rPr>
         <w:t>{{</w:t>
       </w:r>
-      <w:proofErr w:type="spellStart"/>
-      <w:r>
-        <w:rPr>
-          <w:rFonts w:ascii="TH SarabunIT๙" w:hAnsi="TH SarabunIT๙" w:cs="TH SarabunIT๙"/>
-          <w:color w:val="000000" w:themeColor="text1"/>
-          <w:sz w:val="32"/>
-          <w:szCs w:val="32"/>
-          <w:lang w:bidi="th-TH"/>
-        </w:rPr>
-        <w:t>meeting_no</w:t>
-      </w:r>
-      <w:proofErr w:type="spellEnd"/>
-      <w:r>
-        <w:rPr>
-          <w:rFonts w:ascii="TH SarabunIT๙" w:hAnsi="TH SarabunIT๙" w:cs="TH SarabunIT๙"/>
-          <w:color w:val="000000" w:themeColor="text1"/>
-          <w:sz w:val="32"/>
-          <w:szCs w:val="32"/>
-          <w:lang w:bidi="th-TH"/>
-        </w:rPr>
-        <w:t>}}</w:t>
-      </w:r>
-      <w:r>
-        <w:rPr>
-          <w:rFonts w:ascii="TH SarabunIT๙" w:hAnsi="TH SarabunIT๙" w:cs="TH SarabunIT๙"/>
-          <w:color w:val="000000" w:themeColor="text1"/>
-          <w:sz w:val="32"/>
-          <w:szCs w:val="32"/>
-        </w:rPr>
-        <w:t xml:space="preserve"> </w:t>
-      </w:r>
-      <w:r>
-        <w:rPr>
-          <w:rFonts w:ascii="TH SarabunIT๙" w:hAnsi="TH SarabunIT๙" w:cs="TH SarabunIT๙"/>
-          <w:color w:val="000000" w:themeColor="text1"/>
-          <w:sz w:val="32"/>
-          <w:szCs w:val="32"/>
-          <w:cs/>
-        </w:rPr>
-        <w:t>เมื่อวันที่</w:t>
-      </w:r>
-      <w:r>
-        <w:rPr>
-          <w:rFonts w:ascii="TH SarabunIT๙" w:hAnsi="TH SarabunIT๙" w:cs="TH SarabunIT๙"/>
-          <w:color w:val="000000" w:themeColor="text1"/>
-          <w:sz w:val="32"/>
-          <w:szCs w:val="32"/>
-        </w:rPr>
-        <w:t xml:space="preserve"> </w:t>
-      </w:r>
-      <w:r>
-        <w:rPr>
-          <w:rFonts w:ascii="TH SarabunIT๙" w:hAnsi="TH SarabunIT๙" w:cs="TH SarabunIT๙"/>
-          <w:color w:val="000000" w:themeColor="text1"/>
-          <w:sz w:val="32"/>
-          <w:szCs w:val="32"/>
-          <w:lang w:bidi="th-TH"/>
+      <w:r>
+        <w:rPr>
+          <w:rFonts w:ascii="TH Sarabun New" w:hAnsi="TH Sarabun New" w:cs="TH Sarabun New"/>
+          <w:color w:val="000000" w:themeColor="text1"/>
+          <w:sz w:val="32"/>
+          <w:szCs w:val="32"/>
+          <w:shd w:val="clear" w:color="auto" w:fill="FFFFFF"/>
+        </w:rPr>
+        <w:t>course</w:t>
+      </w:r>
+      <w:r>
+        <w:rPr>
+          <w:rFonts w:ascii="TH Sarabun New" w:hAnsi="TH Sarabun New" w:cs="TH Sarabun New"/>
+          <w:color w:val="000000" w:themeColor="text1"/>
+          <w:sz w:val="32"/>
+          <w:szCs w:val="32"/>
+          <w:shd w:val="clear" w:color="auto" w:fill="FFFFFF"/>
+        </w:rPr>
+        <w:t>_</w:t>
+      </w:r>
+      <w:r>
+        <w:rPr>
+          <w:rFonts w:ascii="TH Sarabun New" w:hAnsi="TH Sarabun New" w:cs="TH Sarabun New"/>
+          <w:color w:val="000000" w:themeColor="text1"/>
+          <w:sz w:val="32"/>
+          <w:szCs w:val="32"/>
+          <w:shd w:val="clear" w:color="auto" w:fill="FFFFFF"/>
+        </w:rPr>
+        <w:t>code</w:t>
+      </w:r>
+      <w:r>
+        <w:rPr>
+          <w:rFonts w:ascii="TH Sarabun New" w:hAnsi="TH Sarabun New" w:cs="TH Sarabun New"/>
+          <w:color w:val="000000" w:themeColor="text1"/>
+          <w:sz w:val="32"/>
+          <w:szCs w:val="32"/>
+          <w:shd w:val="clear" w:color="auto" w:fill="FFFFFF"/>
+        </w:rPr>
+        <w:t xml:space="preserve">}} </w:t>
+      </w:r>
+      <w:r>
+        <w:rPr>
+          <w:rFonts w:ascii="TH Sarabun New" w:hAnsi="TH Sarabun New" w:cs="TH Sarabun New"/>
+          <w:color w:val="000000" w:themeColor="text1"/>
+          <w:sz w:val="32"/>
+          <w:szCs w:val="32"/>
+          <w:shd w:val="clear" w:color="auto" w:fill="FFFFFF"/>
+          <w:cs/>
+          <w:lang w:bidi="th-TH"/>
+        </w:rPr>
+        <w:t>ร</w:t>
+      </w:r>
+      <w:r>
+        <w:rPr>
+          <w:rFonts w:ascii="TH Sarabun New" w:hAnsi="TH Sarabun New" w:cs="TH Sarabun New"/>
+          <w:color w:val="000000" w:themeColor="text1"/>
+          <w:sz w:val="32"/>
+          <w:szCs w:val="32"/>
+          <w:cs/>
+        </w:rPr>
+        <w:t>ายวิชา</w:t>
+      </w:r>
+      <w:r>
+        <w:rPr>
+          <w:rFonts w:ascii="TH Sarabun New" w:hAnsi="TH Sarabun New" w:cs="TH Sarabun New"/>
+          <w:color w:val="000000" w:themeColor="text1"/>
+          <w:sz w:val="32"/>
+          <w:szCs w:val="32"/>
+          <w:shd w:val="clear" w:color="auto" w:fill="FFFFFF"/>
         </w:rPr>
         <w:t>{{</w:t>
       </w:r>
-      <w:proofErr w:type="spellStart"/>
-      <w:r>
-        <w:rPr>
-          <w:rFonts w:ascii="TH SarabunIT๙" w:hAnsi="TH SarabunIT๙" w:cs="TH SarabunIT๙"/>
-          <w:color w:val="000000" w:themeColor="text1"/>
-          <w:sz w:val="32"/>
-          <w:szCs w:val="32"/>
-          <w:lang w:bidi="th-TH"/>
-        </w:rPr>
-        <w:t>meet</w:t>
-      </w:r>
-      <w:r>
-        <w:rPr>
-          <w:rFonts w:ascii="TH SarabunIT๙" w:hAnsi="TH SarabunIT๙" w:cs="TH SarabunIT๙"/>
-          <w:color w:val="000000" w:themeColor="text1"/>
-          <w:sz w:val="32"/>
-          <w:szCs w:val="32"/>
-          <w:lang w:bidi="th-TH"/>
-        </w:rPr>
-        <w:t>ing_da</w:t>
-      </w:r>
-      <w:r>
-        <w:rPr>
-          <w:rFonts w:ascii="TH SarabunIT๙" w:hAnsi="TH SarabunIT๙" w:cs="TH SarabunIT๙"/>
-          <w:color w:val="000000" w:themeColor="text1"/>
-          <w:sz w:val="32"/>
-          <w:szCs w:val="32"/>
-          <w:lang w:bidi="th-TH"/>
-        </w:rPr>
-        <w:t>te</w:t>
-      </w:r>
-      <w:proofErr w:type="spellEnd"/>
-      <w:r>
-        <w:rPr>
-          <w:rFonts w:ascii="TH SarabunIT๙" w:hAnsi="TH SarabunIT๙" w:cs="TH SarabunIT๙"/>
-          <w:color w:val="000000" w:themeColor="text1"/>
-          <w:sz w:val="32"/>
-          <w:szCs w:val="32"/>
-          <w:lang w:bidi="th-TH"/>
-        </w:rPr>
-        <w:t>}}</w:t>
-      </w:r>
-      <w:r>
-        <w:rPr>
-          <w:rFonts w:ascii="TH SarabunIT๙" w:hAnsi="TH SarabunIT๙" w:cs="TH SarabunIT๙" w:hint="cs"/>
-          <w:color w:val="000000" w:themeColor="text1"/>
-          <w:sz w:val="32"/>
-          <w:szCs w:val="32"/>
-          <w:cs/>
-          <w:lang w:bidi="th-TH"/>
-        </w:rPr>
-        <w:t xml:space="preserve">  </w:t>
-      </w:r>
-      <w:r>
-        <w:rPr>
-          <w:rFonts w:ascii="TH SarabunIT๙" w:hAnsi="TH SarabunIT๙" w:cs="TH SarabunIT๙"/>
-          <w:color w:val="000000" w:themeColor="text1"/>
-          <w:sz w:val="32"/>
-          <w:szCs w:val="32"/>
-          <w:cs/>
-        </w:rPr>
-        <w:t>ซึ่งได้รับมอบอำนาจจากคณะกรรมการพิจารณาตำแหน่งทางวิชาการ</w:t>
-      </w:r>
-      <w:r>
-        <w:rPr>
-          <w:rFonts w:ascii="TH SarabunIT๙" w:hAnsi="TH SarabunIT๙" w:cs="TH SarabunIT๙" w:hint="cs"/>
-          <w:color w:val="000000" w:themeColor="text1"/>
-          <w:sz w:val="32"/>
-          <w:szCs w:val="32"/>
-          <w:cs/>
-          <w:lang w:bidi="th-TH"/>
-        </w:rPr>
-        <w:t>มหาวิทยาลัยขอนแก่น</w:t>
-      </w:r>
-      <w:r>
-        <w:rPr>
-          <w:rFonts w:ascii="TH SarabunIT๙" w:hAnsi="TH SarabunIT๙" w:cs="TH SarabunIT๙"/>
-          <w:color w:val="000000" w:themeColor="text1"/>
-          <w:sz w:val="32"/>
-          <w:szCs w:val="32"/>
-          <w:cs/>
-        </w:rPr>
-        <w:t xml:space="preserve"> ได้ประเมินผลการสอนรหัสวิชา</w:t>
-      </w:r>
       <w:r>
         <w:rPr>
           <w:rFonts w:ascii="TH Sarabun New" w:hAnsi="TH Sarabun New" w:cs="TH Sarabun New"/>
@@ -287,19 +313,17 @@
           <w:szCs w:val="32"/>
           <w:shd w:val="clear" w:color="auto" w:fill="FFFFFF"/>
         </w:rPr>
-        <w:t xml:space="preserve"> </w:t>
-      </w:r>
-      <w:r>
-        <w:rPr>
-          <w:rFonts w:ascii="TH Sarabun New" w:hAnsi="TH Sarabun New" w:cs="TH Sarabun New" w:hint="cs"/>
+        <w:t>course</w:t>
+      </w:r>
+      <w:r>
+        <w:rPr>
+          <w:rFonts w:ascii="TH Sarabun New" w:hAnsi="TH Sarabun New" w:cs="TH Sarabun New"/>
           <w:color w:val="000000" w:themeColor="text1"/>
           <w:sz w:val="32"/>
           <w:szCs w:val="32"/>
           <w:shd w:val="clear" w:color="auto" w:fill="FFFFFF"/>
-          <w:cs/>
-          <w:lang w:bidi="th-TH"/>
-        </w:rPr>
-        <w:t xml:space="preserve"> </w:t>
+        </w:rPr>
+        <w:t>_name}}</w:t>
       </w:r>
       <w:r>
         <w:rPr>
@@ -309,138 +333,11 @@
           <w:szCs w:val="32"/>
           <w:shd w:val="clear" w:color="auto" w:fill="FFFFFF"/>
         </w:rPr>
-        <w:t>{{</w:t>
-      </w:r>
-      <w:proofErr w:type="spellStart"/>
-      <w:r>
-        <w:rPr>
-          <w:rFonts w:ascii="TH Sarabun New" w:hAnsi="TH Sarabun New" w:cs="TH Sarabun New"/>
-          <w:color w:val="000000" w:themeColor="text1"/>
-          <w:sz w:val="32"/>
-          <w:szCs w:val="32"/>
-          <w:shd w:val="clear" w:color="auto" w:fill="FFFFFF"/>
-        </w:rPr>
-        <w:t>course</w:t>
-      </w:r>
-      <w:r>
-        <w:rPr>
-          <w:rFonts w:ascii="TH Sarabun New" w:hAnsi="TH Sarabun New" w:cs="TH Sarabun New"/>
-          <w:color w:val="000000" w:themeColor="text1"/>
-          <w:sz w:val="32"/>
-          <w:szCs w:val="32"/>
-          <w:shd w:val="clear" w:color="auto" w:fill="FFFFFF"/>
-        </w:rPr>
-        <w:t>_</w:t>
-      </w:r>
-      <w:r>
-        <w:rPr>
-          <w:rFonts w:ascii="TH Sarabun New" w:hAnsi="TH Sarabun New" w:cs="TH Sarabun New"/>
-          <w:color w:val="000000" w:themeColor="text1"/>
-          <w:sz w:val="32"/>
-          <w:szCs w:val="32"/>
-          <w:shd w:val="clear" w:color="auto" w:fill="FFFFFF"/>
-        </w:rPr>
-        <w:t>code</w:t>
-      </w:r>
-      <w:proofErr w:type="spellEnd"/>
-      <w:r>
-        <w:rPr>
-          <w:rFonts w:ascii="TH Sarabun New" w:hAnsi="TH Sarabun New" w:cs="TH Sarabun New"/>
-          <w:color w:val="000000" w:themeColor="text1"/>
-          <w:sz w:val="32"/>
-          <w:szCs w:val="32"/>
-          <w:shd w:val="clear" w:color="auto" w:fill="FFFFFF"/>
-        </w:rPr>
-        <w:t xml:space="preserve">}} </w:t>
-      </w:r>
-      <w:r>
-        <w:rPr>
-          <w:rFonts w:ascii="TH Sarabun New" w:hAnsi="TH Sarabun New" w:cs="TH Sarabun New" w:hint="cs"/>
-          <w:color w:val="000000" w:themeColor="text1"/>
-          <w:sz w:val="32"/>
-          <w:szCs w:val="32"/>
-          <w:shd w:val="clear" w:color="auto" w:fill="FFFFFF"/>
-          <w:cs/>
-          <w:lang w:bidi="th-TH"/>
-        </w:rPr>
-        <w:t>ร</w:t>
-      </w:r>
-      <w:r>
-        <w:rPr>
-          <w:rFonts w:ascii="TH SarabunIT๙" w:hAnsi="TH SarabunIT๙" w:cs="TH SarabunIT๙"/>
-          <w:color w:val="000000" w:themeColor="text1"/>
-          <w:sz w:val="32"/>
-          <w:szCs w:val="32"/>
-          <w:cs/>
-        </w:rPr>
-        <w:t>ายวิชา</w:t>
-      </w:r>
-      <w:r>
-        <w:rPr>
-          <w:rFonts w:ascii="TH SarabunIT๙" w:hAnsi="TH SarabunIT๙" w:cs="TH SarabunIT๙" w:hint="cs"/>
-          <w:color w:val="000000" w:themeColor="text1"/>
-          <w:sz w:val="32"/>
-          <w:szCs w:val="32"/>
-          <w:cs/>
-          <w:lang w:bidi="th-TH"/>
-        </w:rPr>
-        <w:t xml:space="preserve">  </w:t>
-      </w:r>
-      <w:r>
-        <w:rPr>
-          <w:rFonts w:ascii="TH Sarabun New" w:hAnsi="TH Sarabun New" w:cs="TH Sarabun New"/>
-          <w:color w:val="000000" w:themeColor="text1"/>
-          <w:sz w:val="32"/>
-          <w:szCs w:val="32"/>
-          <w:shd w:val="clear" w:color="auto" w:fill="FFFFFF"/>
-        </w:rPr>
-        <w:t>{{</w:t>
-      </w:r>
-      <w:proofErr w:type="spellStart"/>
-      <w:r>
-        <w:rPr>
-          <w:rFonts w:ascii="TH Sarabun New" w:hAnsi="TH Sarabun New" w:cs="TH Sarabun New"/>
-          <w:color w:val="000000" w:themeColor="text1"/>
-          <w:sz w:val="32"/>
-          <w:szCs w:val="32"/>
-          <w:shd w:val="clear" w:color="auto" w:fill="FFFFFF"/>
-        </w:rPr>
-        <w:t>course</w:t>
-      </w:r>
-      <w:r>
-        <w:rPr>
-          <w:rFonts w:ascii="TH Sarabun New" w:hAnsi="TH Sarabun New" w:cs="TH Sarabun New"/>
-          <w:color w:val="000000" w:themeColor="text1"/>
-          <w:sz w:val="32"/>
-          <w:szCs w:val="32"/>
-          <w:shd w:val="clear" w:color="auto" w:fill="FFFFFF"/>
-        </w:rPr>
-        <w:t>_name</w:t>
-      </w:r>
-      <w:proofErr w:type="spellEnd"/>
-      <w:r>
-        <w:rPr>
-          <w:rFonts w:ascii="TH Sarabun New" w:hAnsi="TH Sarabun New" w:cs="TH Sarabun New"/>
-          <w:color w:val="000000" w:themeColor="text1"/>
-          <w:sz w:val="32"/>
-          <w:szCs w:val="32"/>
-          <w:shd w:val="clear" w:color="auto" w:fill="FFFFFF"/>
-        </w:rPr>
-        <w:t>}}</w:t>
-      </w:r>
-      <w:r>
-        <w:rPr>
-          <w:rFonts w:ascii="TH Sarabun New" w:hAnsi="TH Sarabun New" w:cs="TH Sarabun New"/>
-          <w:color w:val="000000" w:themeColor="text1"/>
-          <w:sz w:val="32"/>
-          <w:szCs w:val="32"/>
-          <w:shd w:val="clear" w:color="auto" w:fill="FFFFFF"/>
-        </w:rPr>
         <w:t> </w:t>
       </w:r>
       <w:r>
         <w:rPr>
-          <w:rFonts w:ascii="TH SarabunIT๙" w:hAnsi="TH SarabunIT๙" w:cs="TH SarabunIT๙"/>
+          <w:rFonts w:ascii="TH Sarabun New" w:hAnsi="TH Sarabun New" w:cs="TH Sarabun New"/>
           <w:color w:val="000000" w:themeColor="text1"/>
           <w:sz w:val="32"/>
           <w:szCs w:val="32"/>
@@ -450,68 +347,26 @@
       </w:r>
       <w:r>
         <w:rPr>
-          <w:rFonts w:ascii="TH SarabunIT๙" w:hAnsi="TH SarabunIT๙" w:cs="TH SarabunIT๙"/>
-          <w:color w:val="000000" w:themeColor="text1"/>
-          <w:sz w:val="32"/>
-          <w:szCs w:val="32"/>
-        </w:rPr>
-        <w:t>{{</w:t>
-      </w:r>
-      <w:proofErr w:type="spellStart"/>
-      <w:r>
-        <w:rPr>
-          <w:rFonts w:ascii="TH SarabunIT๙" w:hAnsi="TH SarabunIT๙" w:cs="TH SarabunIT๙"/>
-          <w:color w:val="000000" w:themeColor="text1"/>
-          <w:sz w:val="32"/>
-          <w:szCs w:val="32"/>
-        </w:rPr>
-        <w:t>applicant_title</w:t>
-      </w:r>
-      <w:proofErr w:type="spellEnd"/>
-      <w:r>
-        <w:rPr>
-          <w:rFonts w:ascii="TH SarabunIT๙" w:hAnsi="TH SarabunIT๙" w:cs="TH SarabunIT๙"/>
-          <w:color w:val="000000" w:themeColor="text1"/>
-          <w:sz w:val="32"/>
-          <w:szCs w:val="32"/>
-        </w:rPr>
-        <w:t>}}</w:t>
-      </w:r>
-      <w:r>
-        <w:rPr>
-          <w:rFonts w:ascii="TH SarabunIT๙" w:hAnsi="TH SarabunIT๙" w:cs="TH SarabunIT๙"/>
-          <w:color w:val="000000" w:themeColor="text1"/>
-          <w:sz w:val="32"/>
-          <w:szCs w:val="32"/>
-          <w:lang w:bidi="th-TH"/>
-        </w:rPr>
-        <w:t>{{</w:t>
-      </w:r>
-      <w:proofErr w:type="spellStart"/>
-      <w:r>
-        <w:rPr>
-          <w:rFonts w:ascii="TH SarabunIT๙" w:hAnsi="TH SarabunIT๙" w:cs="TH SarabunIT๙"/>
-          <w:color w:val="000000" w:themeColor="text1"/>
-          <w:sz w:val="32"/>
-          <w:szCs w:val="32"/>
-          <w:lang w:bidi="th-TH"/>
-        </w:rPr>
-        <w:t>applicant_name</w:t>
-      </w:r>
-      <w:proofErr w:type="spellEnd"/>
-      <w:r>
-        <w:rPr>
-          <w:rFonts w:ascii="TH SarabunIT๙" w:hAnsi="TH SarabunIT๙" w:cs="TH SarabunIT๙"/>
-          <w:color w:val="000000" w:themeColor="text1"/>
-          <w:sz w:val="32"/>
-          <w:szCs w:val="32"/>
-          <w:lang w:bidi="th-TH"/>
-        </w:rPr>
-        <w:t>}}</w:t>
-      </w:r>
-      <w:r>
-        <w:rPr>
-          <w:rFonts w:ascii="TH SarabunIT๙" w:hAnsi="TH SarabunIT๙" w:cs="TH SarabunIT๙"/>
+          <w:rFonts w:ascii="TH Sarabun New" w:hAnsi="TH Sarabun New" w:cs="TH Sarabun New"/>
+          <w:color w:val="000000" w:themeColor="text1"/>
+          <w:sz w:val="32"/>
+          <w:szCs w:val="32"/>
+        </w:rPr>
+        <w:t>{{applicant_title}}</w:t>
+      </w:r>
+      <w:r>
+        <w:rPr>
+          <w:rFonts w:ascii="TH Sarabun New" w:hAnsi="TH Sarabun New" w:cs="TH Sarabun New"/>
+          <w:color w:val="000000" w:themeColor="text1"/>
+          <w:sz w:val="32"/>
+          <w:szCs w:val="32"/>
+          <w:lang w:bidi="th-TH"/>
+        </w:rPr>
+        <w:t>{{applicant_name}}</w:t>
+      </w:r>
+      <w:r>
+        <w:rPr>
+          <w:rFonts w:ascii="TH Sarabun New" w:hAnsi="TH Sarabun New" w:cs="TH Sarabun New"/>
           <w:color w:val="000000" w:themeColor="text1"/>
           <w:sz w:val="32"/>
           <w:szCs w:val="32"/>
@@ -525,7 +380,7 @@
         <w:spacing w:after="0" w:line="240" w:lineRule="auto"/>
         <w:jc w:val="thaiDistribute"/>
         <w:rPr>
-          <w:rFonts w:ascii="TH SarabunIT๙" w:hAnsi="TH SarabunIT๙" w:cs="TH SarabunIT๙"/>
+          <w:rFonts w:ascii="TH Sarabun New" w:hAnsi="TH Sarabun New" w:cs="TH Sarabun New"/>
           <w:color w:val="000000" w:themeColor="text1"/>
           <w:sz w:val="16"/>
           <w:szCs w:val="16"/>
@@ -553,16 +408,6 @@
           <w:lang w:bidi="th-TH"/>
         </w:rPr>
         <w:tab/>
-      </w:r>
-      <w:r>
-        <w:rPr>
-          <w:rFonts w:ascii="TH Sarabun New" w:hAnsi="TH Sarabun New" w:cs="TH Sarabun New" w:hint="cs"/>
-          <w:color w:val="000000" w:themeColor="text1"/>
-          <w:sz w:val="32"/>
-          <w:szCs w:val="32"/>
-          <w:cs/>
-          <w:lang w:bidi="th-TH"/>
-        </w:rPr>
         <w:t>(</w:t>
       </w:r>
       <w:r>
@@ -617,7 +462,7 @@
       </w:r>
       <w:r>
         <w:rPr>
-          <w:rFonts w:ascii="TH Sarabun New" w:hAnsi="TH Sarabun New" w:cs="TH Sarabun New" w:hint="cs"/>
+          <w:rFonts w:ascii="TH Sarabun New" w:hAnsi="TH Sarabun New" w:cs="TH Sarabun New"/>
           <w:color w:val="000000" w:themeColor="text1"/>
           <w:sz w:val="32"/>
           <w:szCs w:val="32"/>
@@ -638,7 +483,18 @@
       </w:r>
       <w:r>
         <w:rPr>
-          <w:rFonts w:ascii="TH Sarabun New" w:hAnsi="TH Sarabun New" w:cs="TH Sarabun New" w:hint="cs"/>
+          <w:rFonts w:ascii="TH Sarabun New" w:hAnsi="TH Sarabun New" w:cs="TH Sarabun New"/>
+          <w:color w:val="000000" w:themeColor="text1"/>
+          <w:sz w:val="32"/>
+          <w:szCs w:val="32"/>
+          <w:cs/>
+          <w:lang w:bidi="th-TH"/>
+        </w:rPr>
+        <w:tab/>
+      </w:r>
+      <w:r>
+        <w:rPr>
+          <w:rFonts w:ascii="TH Sarabun New" w:hAnsi="TH Sarabun New" w:cs="TH Sarabun New"/>
           <w:color w:val="000000" w:themeColor="text1"/>
           <w:sz w:val="32"/>
           <w:szCs w:val="32"/>
@@ -669,16 +525,6 @@
           <w:lang w:bidi="th-TH"/>
         </w:rPr>
         <w:tab/>
-      </w:r>
-      <w:r>
-        <w:rPr>
-          <w:rFonts w:ascii="TH Sarabun New" w:hAnsi="TH Sarabun New" w:cs="TH Sarabun New" w:hint="cs"/>
-          <w:color w:val="000000" w:themeColor="text1"/>
-          <w:sz w:val="32"/>
-          <w:szCs w:val="32"/>
-          <w:cs/>
-          <w:lang w:bidi="th-TH"/>
-        </w:rPr>
         <w:t>(</w:t>
       </w:r>
       <w:r>
@@ -733,7 +579,7 @@
       </w:r>
       <w:r>
         <w:rPr>
-          <w:rFonts w:ascii="TH Sarabun New" w:hAnsi="TH Sarabun New" w:cs="TH Sarabun New" w:hint="cs"/>
+          <w:rFonts w:ascii="TH Sarabun New" w:hAnsi="TH Sarabun New" w:cs="TH Sarabun New"/>
           <w:color w:val="000000" w:themeColor="text1"/>
           <w:sz w:val="32"/>
           <w:szCs w:val="32"/>
@@ -752,16 +598,6 @@
           <w:lang w:bidi="th-TH"/>
         </w:rPr>
         <w:tab/>
-      </w:r>
-      <w:r>
-        <w:rPr>
-          <w:rFonts w:ascii="TH Sarabun New" w:hAnsi="TH Sarabun New" w:cs="TH Sarabun New" w:hint="cs"/>
-          <w:color w:val="000000" w:themeColor="text1"/>
-          <w:sz w:val="32"/>
-          <w:szCs w:val="32"/>
-          <w:cs/>
-          <w:lang w:bidi="th-TH"/>
-        </w:rPr>
         <w:t>ชำนาญพิเศษ</w:t>
       </w:r>
     </w:p>
@@ -789,7 +625,7 @@
       </w:r>
       <w:r>
         <w:rPr>
-          <w:rFonts w:ascii="TH Sarabun New" w:hAnsi="TH Sarabun New" w:cs="TH Sarabun New" w:hint="cs"/>
+          <w:rFonts w:ascii="TH Sarabun New" w:hAnsi="TH Sarabun New" w:cs="TH Sarabun New"/>
           <w:color w:val="000000" w:themeColor="text1"/>
           <w:sz w:val="32"/>
           <w:szCs w:val="32"/>
@@ -850,7 +686,7 @@
       </w:r>
       <w:r>
         <w:rPr>
-          <w:rFonts w:ascii="TH Sarabun New" w:hAnsi="TH Sarabun New" w:cs="TH Sarabun New" w:hint="cs"/>
+          <w:rFonts w:ascii="TH Sarabun New" w:hAnsi="TH Sarabun New" w:cs="TH Sarabun New"/>
           <w:color w:val="000000" w:themeColor="text1"/>
           <w:sz w:val="32"/>
           <w:szCs w:val="32"/>
@@ -869,16 +705,6 @@
           <w:lang w:bidi="th-TH"/>
         </w:rPr>
         <w:tab/>
-      </w:r>
-      <w:r>
-        <w:rPr>
-          <w:rFonts w:ascii="TH Sarabun New" w:hAnsi="TH Sarabun New" w:cs="TH Sarabun New" w:hint="cs"/>
-          <w:color w:val="000000" w:themeColor="text1"/>
-          <w:sz w:val="32"/>
-          <w:szCs w:val="32"/>
-          <w:cs/>
-          <w:lang w:bidi="th-TH"/>
-        </w:rPr>
         <w:t>เชี่ยวชาญ</w:t>
       </w:r>
     </w:p>
@@ -887,7 +713,7 @@
         <w:spacing w:after="0" w:line="240" w:lineRule="auto"/>
         <w:jc w:val="thaiDistribute"/>
         <w:rPr>
-          <w:rFonts w:ascii="TH SarabunIT๙" w:hAnsi="TH SarabunIT๙" w:cs="TH SarabunIT๙"/>
+          <w:rFonts w:ascii="TH Sarabun New" w:hAnsi="TH Sarabun New" w:cs="TH Sarabun New"/>
           <w:color w:val="000000" w:themeColor="text1"/>
           <w:sz w:val="16"/>
           <w:szCs w:val="16"/>
@@ -906,7 +732,7 @@
       </w:pPr>
       <w:r>
         <w:rPr>
-          <w:rFonts w:ascii="TH Sarabun New" w:hAnsi="TH Sarabun New" w:cs="TH Sarabun New" w:hint="cs"/>
+          <w:rFonts w:ascii="TH Sarabun New" w:hAnsi="TH Sarabun New" w:cs="TH Sarabun New"/>
           <w:color w:val="000000" w:themeColor="text1"/>
           <w:sz w:val="32"/>
           <w:szCs w:val="32"/>
@@ -920,7 +746,7 @@
       <w:pPr>
         <w:spacing w:after="0" w:line="240" w:lineRule="auto"/>
         <w:rPr>
-          <w:rFonts w:ascii="TH SarabunIT๙" w:hAnsi="TH SarabunIT๙" w:cs="TH SarabunIT๙"/>
+          <w:rFonts w:ascii="TH Sarabun New" w:hAnsi="TH Sarabun New" w:cs="TH Sarabun New"/>
           <w:color w:val="000000" w:themeColor="text1"/>
           <w:sz w:val="32"/>
           <w:szCs w:val="32"/>
@@ -932,7 +758,7 @@
         <w:spacing w:after="0" w:line="240" w:lineRule="auto"/>
         <w:jc w:val="center"/>
         <w:rPr>
-          <w:rFonts w:ascii="TH SarabunIT๙" w:hAnsi="TH SarabunIT๙" w:cs="TH SarabunIT๙"/>
+          <w:rFonts w:ascii="TH Sarabun New" w:hAnsi="TH Sarabun New" w:cs="TH Sarabun New"/>
           <w:color w:val="000000" w:themeColor="text1"/>
           <w:sz w:val="32"/>
           <w:szCs w:val="32"/>
@@ -940,7 +766,7 @@
       </w:pPr>
       <w:r>
         <w:rPr>
-          <w:rFonts w:ascii="TH SarabunIT๙" w:hAnsi="TH SarabunIT๙" w:cs="TH SarabunIT๙"/>
+          <w:rFonts w:ascii="TH Sarabun New" w:hAnsi="TH Sarabun New" w:cs="TH Sarabun New"/>
           <w:color w:val="000000" w:themeColor="text1"/>
           <w:sz w:val="32"/>
           <w:szCs w:val="32"/>
@@ -963,59 +789,27 @@
       </w:pPr>
       <w:r>
         <w:rPr>
-          <w:rFonts w:ascii="TH SarabunIT๙" w:hAnsi="TH SarabunIT๙" w:cs="TH SarabunIT๙" w:hint="cs"/>
-          <w:color w:val="000000" w:themeColor="text1"/>
-          <w:sz w:val="32"/>
-          <w:szCs w:val="32"/>
-          <w:cs/>
-        </w:rPr>
-        <w:t xml:space="preserve"> </w:t>
-      </w:r>
-      <w:r>
-        <w:rPr>
-          <w:rFonts w:ascii="TH SarabunIT๙" w:hAnsi="TH SarabunIT๙" w:cs="TH SarabunIT๙"/>
-          <w:color w:val="000000" w:themeColor="text1"/>
-          <w:sz w:val="32"/>
-          <w:szCs w:val="32"/>
-          <w:cs/>
-        </w:rPr>
-        <w:t>(</w:t>
-      </w:r>
-      <w:r>
-        <w:rPr>
-          <w:rFonts w:ascii="TH Sarabun New" w:hAnsi="TH Sarabun New" w:cs="TH Sarabun New"/>
-          <w:color w:val="000000" w:themeColor="text1"/>
-          <w:sz w:val="32"/>
-          <w:szCs w:val="32"/>
-          <w:lang w:bidi="th-TH"/>
-        </w:rPr>
-        <w:t>{{</w:t>
-      </w:r>
-      <w:proofErr w:type="spellStart"/>
-      <w:r>
-        <w:rPr>
-          <w:rFonts w:ascii="TH Sarabun New" w:hAnsi="TH Sarabun New" w:cs="TH Sarabun New"/>
-          <w:color w:val="000000" w:themeColor="text1"/>
-          <w:sz w:val="32"/>
-          <w:szCs w:val="32"/>
-          <w:lang w:bidi="th-TH"/>
-        </w:rPr>
-        <w:t>committee_president_name</w:t>
-      </w:r>
-      <w:proofErr w:type="spellEnd"/>
-      <w:r>
-        <w:rPr>
-          <w:rFonts w:ascii="TH Sarabun New" w:hAnsi="TH Sarabun New" w:cs="TH Sarabun New"/>
-          <w:color w:val="000000" w:themeColor="text1"/>
-          <w:sz w:val="32"/>
-          <w:szCs w:val="32"/>
-          <w:lang w:bidi="th-TH"/>
-        </w:rPr>
-        <w:t>}}</w:t>
-      </w:r>
-      <w:r>
-        <w:rPr>
-          <w:rFonts w:ascii="TH SarabunIT๙" w:hAnsi="TH SarabunIT๙" w:cs="TH SarabunIT๙"/>
+          <w:rFonts w:ascii="TH Sarabun New" w:hAnsi="TH Sarabun New" w:cs="TH Sarabun New"/>
+          <w:color w:val="000000" w:themeColor="text1"/>
+          <w:sz w:val="32"/>
+          <w:szCs w:val="32"/>
+          <w:cs/>
+        </w:rPr>
+        <w:t xml:space="preserve"> (</w:t>
+      </w:r>
+      <w:r>
+        <w:rPr>
+          <w:rFonts w:ascii="TH Sarabun New" w:hAnsi="TH Sarabun New" w:cs="TH Sarabun New"/>
+          <w:color w:val="000000" w:themeColor="text1"/>
+          <w:sz w:val="32"/>
+          <w:szCs w:val="32"/>
+          <w:lang w:bidi="th-TH"/>
+        </w:rPr>
+        <w:t>{{committee_president_name}}</w:t>
+      </w:r>
+      <w:r>
+        <w:rPr>
+          <w:rFonts w:ascii="TH Sarabun New" w:hAnsi="TH Sarabun New" w:cs="TH Sarabun New"/>
           <w:color w:val="000000" w:themeColor="text1"/>
           <w:sz w:val="32"/>
           <w:szCs w:val="32"/>
@@ -1029,7 +823,7 @@
         <w:spacing w:after="0" w:line="240" w:lineRule="auto"/>
         <w:jc w:val="center"/>
         <w:rPr>
-          <w:rFonts w:ascii="TH SarabunIT๙" w:hAnsi="TH SarabunIT๙" w:cs="TH SarabunIT๙"/>
+          <w:rFonts w:ascii="TH Sarabun New" w:hAnsi="TH Sarabun New" w:cs="TH Sarabun New"/>
           <w:color w:val="000000" w:themeColor="text1"/>
           <w:sz w:val="32"/>
           <w:szCs w:val="32"/>
@@ -1037,33 +831,13 @@
       </w:pPr>
       <w:r>
         <w:rPr>
-          <w:rFonts w:ascii="TH SarabunIT๙" w:hAnsi="TH SarabunIT๙" w:cs="TH SarabunIT๙"/>
-          <w:color w:val="000000" w:themeColor="text1"/>
-          <w:sz w:val="32"/>
-          <w:szCs w:val="32"/>
-          <w:cs/>
-        </w:rPr>
-        <w:t>ตำแหน่ง</w:t>
-      </w:r>
-      <w:r>
-        <w:rPr>
-          <w:rFonts w:ascii="TH SarabunIT๙" w:hAnsi="TH SarabunIT๙" w:cs="TH SarabunIT๙" w:hint="cs"/>
-          <w:color w:val="000000" w:themeColor="text1"/>
-          <w:sz w:val="32"/>
-          <w:szCs w:val="32"/>
-          <w:cs/>
-        </w:rPr>
-        <w:t xml:space="preserve"> </w:t>
-      </w:r>
-      <w:r>
-        <w:rPr>
-          <w:rFonts w:ascii="TH SarabunIT๙" w:hAnsi="TH SarabunIT๙" w:cs="TH SarabunIT๙"/>
-          <w:color w:val="000000" w:themeColor="text1"/>
-          <w:sz w:val="32"/>
-          <w:szCs w:val="32"/>
-          <w:cs/>
-        </w:rPr>
-        <w:t>ประธานคณะอนุกรรมการเพื่อประเมินผลการสอน</w:t>
+          <w:rFonts w:ascii="TH Sarabun New" w:hAnsi="TH Sarabun New" w:cs="TH Sarabun New"/>
+          <w:color w:val="000000" w:themeColor="text1"/>
+          <w:sz w:val="32"/>
+          <w:szCs w:val="32"/>
+          <w:cs/>
+        </w:rPr>
+        <w:t>ตำแหน่ง ประธานคณะอนุกรรมการเพื่อประเมินผลการสอน</w:t>
       </w:r>
     </w:p>
     <w:p>
@@ -1071,7 +845,7 @@
         <w:spacing w:after="0" w:line="240" w:lineRule="auto"/>
         <w:jc w:val="center"/>
         <w:rPr>
-          <w:rFonts w:ascii="TH SarabunIT๙" w:hAnsi="TH SarabunIT๙" w:cs="TH SarabunIT๙"/>
+          <w:rFonts w:ascii="TH Sarabun New" w:hAnsi="TH Sarabun New" w:cs="TH Sarabun New"/>
           <w:color w:val="000000" w:themeColor="text1"/>
           <w:sz w:val="32"/>
           <w:szCs w:val="32"/>
@@ -1079,7 +853,7 @@
       </w:pPr>
       <w:r>
         <w:rPr>
-          <w:rFonts w:ascii="TH SarabunIT๙" w:hAnsi="TH SarabunIT๙" w:cs="TH SarabunIT๙"/>
+          <w:rFonts w:ascii="TH Sarabun New" w:hAnsi="TH Sarabun New" w:cs="TH Sarabun New"/>
           <w:color w:val="000000" w:themeColor="text1"/>
           <w:sz w:val="32"/>
           <w:szCs w:val="32"/>
@@ -1089,7 +863,7 @@
       </w:r>
       <w:r>
         <w:rPr>
-          <w:rFonts w:ascii="TH SarabunIT๙" w:hAnsi="TH SarabunIT๙" w:cs="TH SarabunIT๙" w:hint="cs"/>
+          <w:rFonts w:ascii="TH Sarabun New" w:hAnsi="TH Sarabun New" w:cs="TH Sarabun New"/>
           <w:color w:val="000000" w:themeColor="text1"/>
           <w:sz w:val="32"/>
           <w:szCs w:val="32"/>
@@ -1108,7 +882,6 @@
         </w:rPr>
         <w:t>{{</w:t>
       </w:r>
-      <w:proofErr w:type="spellStart"/>
       <w:r>
         <w:rPr>
           <w:rFonts w:ascii="TH Sarabun New" w:hAnsi="TH Sarabun New" w:cs="TH Sarabun New"/>
@@ -1119,7 +892,6 @@
         </w:rPr>
         <w:t>sign_date</w:t>
       </w:r>
-      <w:proofErr w:type="spellEnd"/>
       <w:r>
         <w:rPr>
           <w:rFonts w:ascii="TH Sarabun New" w:hAnsi="TH Sarabun New" w:cs="TH Sarabun New"/>
@@ -1562,16 +1334,17 @@
     <w:lsdException w:name="Unresolved Mention" w:semiHidden="1" w:unhideWhenUsed="1"/>
     <w:lsdException w:name="Smart Link" w:semiHidden="1" w:unhideWhenUsed="1"/>
   </w:latentStyles>
-  <w:style w:type="paragraph" w:default="1" w:styleId="a">
+  <w:style w:type="paragraph" w:default="1" w:styleId="Normal">
     <w:name w:val="Normal"/>
     <w:qFormat/>
   </w:style>
-  <w:style w:type="character" w:default="1" w:styleId="a0">
+  <w:style w:type="character" w:default="1" w:styleId="DefaultParagraphFont">
     <w:name w:val="Default Paragraph Font"/>
     <w:uiPriority w:val="1"/>
+    <w:semiHidden/>
     <w:unhideWhenUsed/>
   </w:style>
-  <w:style w:type="table" w:default="1" w:styleId="a1">
+  <w:style w:type="table" w:default="1" w:styleId="TableNormal">
     <w:name w:val="Normal Table"/>
     <w:uiPriority w:val="99"/>
     <w:semiHidden/>
@@ -1586,7 +1359,7 @@
       </w:tblCellMar>
     </w:tblPr>
   </w:style>
-  <w:style w:type="numbering" w:default="1" w:styleId="a2">
+  <w:style w:type="numbering" w:default="1" w:styleId="NoList">
     <w:name w:val="No List"/>
     <w:uiPriority w:val="99"/>
     <w:semiHidden/>

</xml_diff>

<commit_message>
Add Thai date picker and update docx uploads
Replace plain ref_memo_date input with an input-group in academic/admin/doc_fragments/8.html to provide a Thai-format text field, hidden native date input, and calendar button for date selection. Also update the docx template and uploaded documents: src/main/resources/templates/docx/doc_7.docx changed, uploads/academic/8/doc_6.docx updated, and new files uploads/academic/8/doc_7.docx and uploads/academic/8/doc_8.docx added.
</commit_message>
<xml_diff>
--- a/shopping-cart-spring-boot-main/src/main/resources/templates/docx/doc_7.docx
+++ b/shopping-cart-spring-boot-main/src/main/resources/templates/docx/doc_7.docx
@@ -91,6 +91,7 @@
         </w:rPr>
         <w:t>{{</w:t>
       </w:r>
+      <w:proofErr w:type="spellStart"/>
       <w:r>
         <w:rPr>
           <w:rFonts w:ascii="TH Sarabun New" w:hAnsi="TH Sarabun New" w:cs="TH Sarabun New"/>
@@ -101,6 +102,7 @@
         </w:rPr>
         <w:t>meeting_no</w:t>
       </w:r>
+      <w:proofErr w:type="spellEnd"/>
       <w:r>
         <w:rPr>
           <w:rFonts w:ascii="TH Sarabun New" w:hAnsi="TH Sarabun New" w:cs="TH Sarabun New"/>
@@ -120,6 +122,35 @@
         </w:rPr>
         <w:t xml:space="preserve"> </w:t>
       </w:r>
+      <w:r>
+        <w:rPr>
+          <w:rFonts w:ascii="TH Sarabun New" w:hAnsi="TH Sarabun New" w:cs="TH Sarabun New"/>
+          <w:color w:val="000000" w:themeColor="text1"/>
+          <w:sz w:val="32"/>
+          <w:szCs w:val="32"/>
+          <w:cs/>
+        </w:rPr>
+        <w:t>เมื่อวันที่</w:t>
+      </w:r>
+      <w:r>
+        <w:rPr>
+          <w:rFonts w:ascii="TH Sarabun New" w:hAnsi="TH Sarabun New" w:cs="TH Sarabun New"/>
+          <w:color w:val="000000" w:themeColor="text1"/>
+          <w:sz w:val="32"/>
+          <w:szCs w:val="32"/>
+        </w:rPr>
+        <w:t xml:space="preserve"> </w:t>
+      </w:r>
+      <w:r>
+        <w:rPr>
+          <w:rFonts w:ascii="TH Sarabun New" w:hAnsi="TH Sarabun New" w:cs="TH Sarabun New"/>
+          <w:color w:val="000000" w:themeColor="text1"/>
+          <w:sz w:val="32"/>
+          <w:szCs w:val="32"/>
+          <w:lang w:bidi="th-TH"/>
+        </w:rPr>
+        <w:t>{{</w:t>
+      </w:r>
       <w:proofErr w:type="spellStart"/>
       <w:r>
         <w:rPr>
@@ -127,9 +158,29 @@
           <w:color w:val="000000" w:themeColor="text1"/>
           <w:sz w:val="32"/>
           <w:szCs w:val="32"/>
-          <w:cs/>
-        </w:rPr>
-        <w:t>เมื่อวันที่</w:t>
+          <w:lang w:bidi="th-TH"/>
+        </w:rPr>
+        <w:t>meet</w:t>
+      </w:r>
+      <w:r>
+        <w:rPr>
+          <w:rFonts w:ascii="TH Sarabun New" w:hAnsi="TH Sarabun New" w:cs="TH Sarabun New"/>
+          <w:color w:val="000000" w:themeColor="text1"/>
+          <w:sz w:val="32"/>
+          <w:szCs w:val="32"/>
+          <w:lang w:bidi="th-TH"/>
+        </w:rPr>
+        <w:t>ing_da</w:t>
+      </w:r>
+      <w:r>
+        <w:rPr>
+          <w:rFonts w:ascii="TH Sarabun New" w:hAnsi="TH Sarabun New" w:cs="TH Sarabun New"/>
+          <w:color w:val="000000" w:themeColor="text1"/>
+          <w:sz w:val="32"/>
+          <w:szCs w:val="32"/>
+          <w:lang w:bidi="th-TH"/>
+        </w:rPr>
+        <w:t>te</w:t>
       </w:r>
       <w:proofErr w:type="spellEnd"/>
       <w:r>
@@ -138,6 +189,58 @@
           <w:color w:val="000000" w:themeColor="text1"/>
           <w:sz w:val="32"/>
           <w:szCs w:val="32"/>
+          <w:lang w:bidi="th-TH"/>
+        </w:rPr>
+        <w:t>}}</w:t>
+      </w:r>
+      <w:r>
+        <w:rPr>
+          <w:rFonts w:ascii="TH Sarabun New" w:hAnsi="TH Sarabun New" w:cs="TH Sarabun New"/>
+          <w:color w:val="000000" w:themeColor="text1"/>
+          <w:sz w:val="32"/>
+          <w:szCs w:val="32"/>
+          <w:cs/>
+          <w:lang w:bidi="th-TH"/>
+        </w:rPr>
+        <w:t xml:space="preserve">  </w:t>
+      </w:r>
+      <w:r>
+        <w:rPr>
+          <w:rFonts w:ascii="TH Sarabun New" w:hAnsi="TH Sarabun New" w:cs="TH Sarabun New"/>
+          <w:color w:val="000000" w:themeColor="text1"/>
+          <w:sz w:val="32"/>
+          <w:szCs w:val="32"/>
+          <w:cs/>
+        </w:rPr>
+        <w:t>ซึ่งได้รับมอบอำนาจจากคณะกรรมการพิจารณาตำแหน่งทางวิชาการ</w:t>
+      </w:r>
+      <w:r>
+        <w:rPr>
+          <w:rFonts w:ascii="TH Sarabun New" w:hAnsi="TH Sarabun New" w:cs="TH Sarabun New"/>
+          <w:color w:val="000000" w:themeColor="text1"/>
+          <w:sz w:val="32"/>
+          <w:szCs w:val="32"/>
+          <w:cs/>
+          <w:lang w:bidi="th-TH"/>
+        </w:rPr>
+        <w:t>มหาวิทยาลัยขอนแก่น</w:t>
+      </w:r>
+      <w:r>
+        <w:rPr>
+          <w:rFonts w:ascii="TH Sarabun New" w:hAnsi="TH Sarabun New" w:cs="TH Sarabun New"/>
+          <w:color w:val="000000" w:themeColor="text1"/>
+          <w:sz w:val="32"/>
+          <w:szCs w:val="32"/>
+          <w:cs/>
+        </w:rPr>
+        <w:t xml:space="preserve"> ได้ประเมินผลการสอนรหัสวิชา</w:t>
+      </w:r>
+      <w:r>
+        <w:rPr>
+          <w:rFonts w:ascii="TH Sarabun New" w:hAnsi="TH Sarabun New" w:cs="TH Sarabun New"/>
+          <w:color w:val="000000" w:themeColor="text1"/>
+          <w:sz w:val="32"/>
+          <w:szCs w:val="32"/>
         </w:rPr>
         <w:t xml:space="preserve"> </w:t>
       </w:r>
@@ -147,37 +250,122 @@
           <w:color w:val="000000" w:themeColor="text1"/>
           <w:sz w:val="32"/>
           <w:szCs w:val="32"/>
-          <w:lang w:bidi="th-TH"/>
-        </w:rPr>
-        <w:t>{{meet</w:t>
-      </w:r>
-      <w:r>
-        <w:rPr>
-          <w:rFonts w:ascii="TH Sarabun New" w:hAnsi="TH Sarabun New" w:cs="TH Sarabun New"/>
-          <w:color w:val="000000" w:themeColor="text1"/>
-          <w:sz w:val="32"/>
-          <w:szCs w:val="32"/>
-          <w:lang w:bidi="th-TH"/>
-        </w:rPr>
-        <w:t>ing_da</w:t>
-      </w:r>
-      <w:r>
-        <w:rPr>
-          <w:rFonts w:ascii="TH Sarabun New" w:hAnsi="TH Sarabun New" w:cs="TH Sarabun New"/>
-          <w:color w:val="000000" w:themeColor="text1"/>
-          <w:sz w:val="32"/>
-          <w:szCs w:val="32"/>
-          <w:lang w:bidi="th-TH"/>
-        </w:rPr>
-        <w:t>te</w:t>
-      </w:r>
-      <w:r>
-        <w:rPr>
-          <w:rFonts w:ascii="TH Sarabun New" w:hAnsi="TH Sarabun New" w:cs="TH Sarabun New"/>
-          <w:color w:val="000000" w:themeColor="text1"/>
-          <w:sz w:val="32"/>
-          <w:szCs w:val="32"/>
-          <w:lang w:bidi="th-TH"/>
+          <w:shd w:val="clear" w:color="auto" w:fill="FFFFFF"/>
+        </w:rPr>
+        <w:t>{{</w:t>
+      </w:r>
+      <w:proofErr w:type="spellStart"/>
+      <w:r>
+        <w:rPr>
+          <w:rFonts w:ascii="TH Sarabun New" w:hAnsi="TH Sarabun New" w:cs="TH Sarabun New"/>
+          <w:color w:val="000000" w:themeColor="text1"/>
+          <w:sz w:val="32"/>
+          <w:szCs w:val="32"/>
+          <w:shd w:val="clear" w:color="auto" w:fill="FFFFFF"/>
+        </w:rPr>
+        <w:t>course</w:t>
+      </w:r>
+      <w:r>
+        <w:rPr>
+          <w:rFonts w:ascii="TH Sarabun New" w:hAnsi="TH Sarabun New" w:cs="TH Sarabun New"/>
+          <w:color w:val="000000" w:themeColor="text1"/>
+          <w:sz w:val="32"/>
+          <w:szCs w:val="32"/>
+          <w:shd w:val="clear" w:color="auto" w:fill="FFFFFF"/>
+        </w:rPr>
+        <w:t>_</w:t>
+      </w:r>
+      <w:r>
+        <w:rPr>
+          <w:rFonts w:ascii="TH Sarabun New" w:hAnsi="TH Sarabun New" w:cs="TH Sarabun New"/>
+          <w:color w:val="000000" w:themeColor="text1"/>
+          <w:sz w:val="32"/>
+          <w:szCs w:val="32"/>
+          <w:shd w:val="clear" w:color="auto" w:fill="FFFFFF"/>
+        </w:rPr>
+        <w:t>code</w:t>
+      </w:r>
+      <w:proofErr w:type="spellEnd"/>
+      <w:r>
+        <w:rPr>
+          <w:rFonts w:ascii="TH Sarabun New" w:hAnsi="TH Sarabun New" w:cs="TH Sarabun New"/>
+          <w:color w:val="000000" w:themeColor="text1"/>
+          <w:sz w:val="32"/>
+          <w:szCs w:val="32"/>
+          <w:shd w:val="clear" w:color="auto" w:fill="FFFFFF"/>
+        </w:rPr>
+        <w:t xml:space="preserve">}} </w:t>
+      </w:r>
+      <w:r>
+        <w:rPr>
+          <w:rFonts w:ascii="TH Sarabun New" w:hAnsi="TH Sarabun New" w:cs="TH Sarabun New"/>
+          <w:color w:val="000000" w:themeColor="text1"/>
+          <w:sz w:val="32"/>
+          <w:szCs w:val="32"/>
+          <w:shd w:val="clear" w:color="auto" w:fill="FFFFFF"/>
+          <w:cs/>
+          <w:lang w:bidi="th-TH"/>
+        </w:rPr>
+        <w:t>ร</w:t>
+      </w:r>
+      <w:r>
+        <w:rPr>
+          <w:rFonts w:ascii="TH Sarabun New" w:hAnsi="TH Sarabun New" w:cs="TH Sarabun New"/>
+          <w:color w:val="000000" w:themeColor="text1"/>
+          <w:sz w:val="32"/>
+          <w:szCs w:val="32"/>
+          <w:cs/>
+        </w:rPr>
+        <w:t>ายวิชา</w:t>
+      </w:r>
+      <w:r>
+        <w:rPr>
+          <w:rFonts w:ascii="TH Sarabun New" w:hAnsi="TH Sarabun New" w:cs="TH Sarabun New"/>
+          <w:color w:val="000000" w:themeColor="text1"/>
+          <w:sz w:val="32"/>
+          <w:szCs w:val="32"/>
+        </w:rPr>
+        <w:t xml:space="preserve"> </w:t>
+      </w:r>
+      <w:r>
+        <w:rPr>
+          <w:rFonts w:ascii="TH Sarabun New" w:hAnsi="TH Sarabun New" w:cs="TH Sarabun New"/>
+          <w:color w:val="000000" w:themeColor="text1"/>
+          <w:sz w:val="32"/>
+          <w:szCs w:val="32"/>
+          <w:shd w:val="clear" w:color="auto" w:fill="FFFFFF"/>
+        </w:rPr>
+        <w:t>{{</w:t>
+      </w:r>
+      <w:proofErr w:type="spellStart"/>
+      <w:r>
+        <w:rPr>
+          <w:rFonts w:ascii="TH Sarabun New" w:hAnsi="TH Sarabun New" w:cs="TH Sarabun New"/>
+          <w:color w:val="000000" w:themeColor="text1"/>
+          <w:sz w:val="32"/>
+          <w:szCs w:val="32"/>
+          <w:shd w:val="clear" w:color="auto" w:fill="FFFFFF"/>
+        </w:rPr>
+        <w:t>course</w:t>
+      </w:r>
+      <w:r>
+        <w:rPr>
+          <w:rFonts w:ascii="TH Sarabun New" w:hAnsi="TH Sarabun New" w:cs="TH Sarabun New"/>
+          <w:color w:val="000000" w:themeColor="text1"/>
+          <w:sz w:val="32"/>
+          <w:szCs w:val="32"/>
+          <w:shd w:val="clear" w:color="auto" w:fill="FFFFFF"/>
+        </w:rPr>
+        <w:t>_name</w:t>
+      </w:r>
+      <w:proofErr w:type="spellEnd"/>
+      <w:r>
+        <w:rPr>
+          <w:rFonts w:ascii="TH Sarabun New" w:hAnsi="TH Sarabun New" w:cs="TH Sarabun New"/>
+          <w:color w:val="000000" w:themeColor="text1"/>
+          <w:sz w:val="32"/>
+          <w:szCs w:val="32"/>
+          <w:shd w:val="clear" w:color="auto" w:fill="FFFFFF"/>
         </w:rPr>
         <w:t>}}</w:t>
       </w:r>
@@ -187,182 +375,89 @@
           <w:color w:val="000000" w:themeColor="text1"/>
           <w:sz w:val="32"/>
           <w:szCs w:val="32"/>
-          <w:cs/>
-          <w:lang w:bidi="th-TH"/>
-        </w:rPr>
-        <w:t xml:space="preserve">  </w:t>
-      </w:r>
-      <w:r>
-        <w:rPr>
-          <w:rFonts w:ascii="TH Sarabun New" w:hAnsi="TH Sarabun New" w:cs="TH Sarabun New"/>
-          <w:color w:val="000000" w:themeColor="text1"/>
-          <w:sz w:val="32"/>
-          <w:szCs w:val="32"/>
-          <w:cs/>
-        </w:rPr>
-        <w:t>ซึ่งได้รับมอบอำนาจจากคณะกรรมการพิจารณาตำแหน่งทางวิชาการ</w:t>
-      </w:r>
-      <w:r>
-        <w:rPr>
-          <w:rFonts w:ascii="TH Sarabun New" w:hAnsi="TH Sarabun New" w:cs="TH Sarabun New"/>
-          <w:color w:val="000000" w:themeColor="text1"/>
-          <w:sz w:val="32"/>
-          <w:szCs w:val="32"/>
-          <w:cs/>
-          <w:lang w:bidi="th-TH"/>
-        </w:rPr>
-        <w:t>มหาวิทยาลัยขอนแก่น</w:t>
-      </w:r>
-      <w:r>
-        <w:rPr>
-          <w:rFonts w:ascii="TH Sarabun New" w:hAnsi="TH Sarabun New" w:cs="TH Sarabun New"/>
-          <w:color w:val="000000" w:themeColor="text1"/>
-          <w:sz w:val="32"/>
-          <w:szCs w:val="32"/>
-          <w:cs/>
-        </w:rPr>
-        <w:t xml:space="preserve"> ได้ประเมินผลการสอนรหัสวิชา</w:t>
-      </w:r>
-      <w:r>
-        <w:rPr>
-          <w:rFonts w:ascii="TH Sarabun New" w:hAnsi="TH Sarabun New" w:cs="TH Sarabun New"/>
-          <w:color w:val="000000" w:themeColor="text1"/>
-          <w:sz w:val="32"/>
-          <w:szCs w:val="32"/>
           <w:shd w:val="clear" w:color="auto" w:fill="FFFFFF"/>
         </w:rPr>
+        <w:t> </w:t>
+      </w:r>
+      <w:r>
+        <w:rPr>
+          <w:rFonts w:ascii="TH Sarabun New" w:hAnsi="TH Sarabun New" w:cs="TH Sarabun New"/>
+          <w:color w:val="000000" w:themeColor="text1"/>
+          <w:sz w:val="32"/>
+          <w:szCs w:val="32"/>
+          <w:cs/>
+        </w:rPr>
+        <w:t xml:space="preserve">ของ </w:t>
+      </w:r>
+      <w:r>
+        <w:rPr>
+          <w:rFonts w:ascii="TH Sarabun New" w:hAnsi="TH Sarabun New" w:cs="TH Sarabun New"/>
+          <w:color w:val="000000" w:themeColor="text1"/>
+          <w:sz w:val="32"/>
+          <w:szCs w:val="32"/>
+        </w:rPr>
         <w:t>{{</w:t>
       </w:r>
-      <w:r>
-        <w:rPr>
-          <w:rFonts w:ascii="TH Sarabun New" w:hAnsi="TH Sarabun New" w:cs="TH Sarabun New"/>
-          <w:color w:val="000000" w:themeColor="text1"/>
-          <w:sz w:val="32"/>
-          <w:szCs w:val="32"/>
-          <w:shd w:val="clear" w:color="auto" w:fill="FFFFFF"/>
-        </w:rPr>
-        <w:t>course</w:t>
-      </w:r>
-      <w:r>
-        <w:rPr>
-          <w:rFonts w:ascii="TH Sarabun New" w:hAnsi="TH Sarabun New" w:cs="TH Sarabun New"/>
-          <w:color w:val="000000" w:themeColor="text1"/>
-          <w:sz w:val="32"/>
-          <w:szCs w:val="32"/>
-          <w:shd w:val="clear" w:color="auto" w:fill="FFFFFF"/>
-        </w:rPr>
-        <w:t>_</w:t>
-      </w:r>
-      <w:r>
-        <w:rPr>
-          <w:rFonts w:ascii="TH Sarabun New" w:hAnsi="TH Sarabun New" w:cs="TH Sarabun New"/>
-          <w:color w:val="000000" w:themeColor="text1"/>
-          <w:sz w:val="32"/>
-          <w:szCs w:val="32"/>
-          <w:shd w:val="clear" w:color="auto" w:fill="FFFFFF"/>
-        </w:rPr>
-        <w:t>code</w:t>
-      </w:r>
-      <w:r>
-        <w:rPr>
-          <w:rFonts w:ascii="TH Sarabun New" w:hAnsi="TH Sarabun New" w:cs="TH Sarabun New"/>
-          <w:color w:val="000000" w:themeColor="text1"/>
-          <w:sz w:val="32"/>
-          <w:szCs w:val="32"/>
-          <w:shd w:val="clear" w:color="auto" w:fill="FFFFFF"/>
-        </w:rPr>
-        <w:t xml:space="preserve">}} </w:t>
-      </w:r>
-      <w:r>
-        <w:rPr>
-          <w:rFonts w:ascii="TH Sarabun New" w:hAnsi="TH Sarabun New" w:cs="TH Sarabun New"/>
-          <w:color w:val="000000" w:themeColor="text1"/>
-          <w:sz w:val="32"/>
-          <w:szCs w:val="32"/>
-          <w:shd w:val="clear" w:color="auto" w:fill="FFFFFF"/>
-          <w:cs/>
-          <w:lang w:bidi="th-TH"/>
-        </w:rPr>
-        <w:t>ร</w:t>
-      </w:r>
-      <w:r>
-        <w:rPr>
-          <w:rFonts w:ascii="TH Sarabun New" w:hAnsi="TH Sarabun New" w:cs="TH Sarabun New"/>
-          <w:color w:val="000000" w:themeColor="text1"/>
-          <w:sz w:val="32"/>
-          <w:szCs w:val="32"/>
-          <w:cs/>
-        </w:rPr>
-        <w:t>ายวิชา</w:t>
-      </w:r>
-      <w:r>
-        <w:rPr>
-          <w:rFonts w:ascii="TH Sarabun New" w:hAnsi="TH Sarabun New" w:cs="TH Sarabun New"/>
-          <w:color w:val="000000" w:themeColor="text1"/>
-          <w:sz w:val="32"/>
-          <w:szCs w:val="32"/>
-          <w:shd w:val="clear" w:color="auto" w:fill="FFFFFF"/>
+      <w:proofErr w:type="spellStart"/>
+      <w:r>
+        <w:rPr>
+          <w:rFonts w:ascii="TH Sarabun New" w:hAnsi="TH Sarabun New" w:cs="TH Sarabun New"/>
+          <w:color w:val="000000" w:themeColor="text1"/>
+          <w:sz w:val="32"/>
+          <w:szCs w:val="32"/>
+        </w:rPr>
+        <w:t>applicant_title</w:t>
+      </w:r>
+      <w:proofErr w:type="spellEnd"/>
+      <w:r>
+        <w:rPr>
+          <w:rFonts w:ascii="TH Sarabun New" w:hAnsi="TH Sarabun New" w:cs="TH Sarabun New"/>
+          <w:color w:val="000000" w:themeColor="text1"/>
+          <w:sz w:val="32"/>
+          <w:szCs w:val="32"/>
+        </w:rPr>
+        <w:t>}}</w:t>
+      </w:r>
+      <w:r>
+        <w:rPr>
+          <w:rFonts w:ascii="TH Sarabun New" w:hAnsi="TH Sarabun New" w:cs="TH Sarabun New"/>
+          <w:color w:val="000000" w:themeColor="text1"/>
+          <w:sz w:val="32"/>
+          <w:szCs w:val="32"/>
+          <w:lang w:bidi="th-TH"/>
         </w:rPr>
         <w:t>{{</w:t>
       </w:r>
-      <w:r>
-        <w:rPr>
-          <w:rFonts w:ascii="TH Sarabun New" w:hAnsi="TH Sarabun New" w:cs="TH Sarabun New"/>
-          <w:color w:val="000000" w:themeColor="text1"/>
-          <w:sz w:val="32"/>
-          <w:szCs w:val="32"/>
-          <w:shd w:val="clear" w:color="auto" w:fill="FFFFFF"/>
-        </w:rPr>
-        <w:t>course</w:t>
-      </w:r>
-      <w:r>
-        <w:rPr>
-          <w:rFonts w:ascii="TH Sarabun New" w:hAnsi="TH Sarabun New" w:cs="TH Sarabun New"/>
-          <w:color w:val="000000" w:themeColor="text1"/>
-          <w:sz w:val="32"/>
-          <w:szCs w:val="32"/>
-          <w:shd w:val="clear" w:color="auto" w:fill="FFFFFF"/>
-        </w:rPr>
-        <w:t>_name}}</w:t>
-      </w:r>
-      <w:r>
-        <w:rPr>
-          <w:rFonts w:ascii="TH Sarabun New" w:hAnsi="TH Sarabun New" w:cs="TH Sarabun New"/>
-          <w:color w:val="000000" w:themeColor="text1"/>
-          <w:sz w:val="32"/>
-          <w:szCs w:val="32"/>
-          <w:shd w:val="clear" w:color="auto" w:fill="FFFFFF"/>
-        </w:rPr>
-        <w:t> </w:t>
-      </w:r>
-      <w:r>
-        <w:rPr>
-          <w:rFonts w:ascii="TH Sarabun New" w:hAnsi="TH Sarabun New" w:cs="TH Sarabun New"/>
-          <w:color w:val="000000" w:themeColor="text1"/>
-          <w:sz w:val="32"/>
-          <w:szCs w:val="32"/>
-          <w:cs/>
-        </w:rPr>
-        <w:t xml:space="preserve">ของ </w:t>
-      </w:r>
-      <w:r>
-        <w:rPr>
-          <w:rFonts w:ascii="TH Sarabun New" w:hAnsi="TH Sarabun New" w:cs="TH Sarabun New"/>
-          <w:color w:val="000000" w:themeColor="text1"/>
-          <w:sz w:val="32"/>
-          <w:szCs w:val="32"/>
-        </w:rPr>
-        <w:t>{{applicant_title}}</w:t>
-      </w:r>
-      <w:r>
-        <w:rPr>
-          <w:rFonts w:ascii="TH Sarabun New" w:hAnsi="TH Sarabun New" w:cs="TH Sarabun New"/>
-          <w:color w:val="000000" w:themeColor="text1"/>
-          <w:sz w:val="32"/>
-          <w:szCs w:val="32"/>
-          <w:lang w:bidi="th-TH"/>
-        </w:rPr>
-        <w:t>{{applicant_name}}</w:t>
+      <w:proofErr w:type="spellStart"/>
+      <w:r>
+        <w:rPr>
+          <w:rFonts w:ascii="TH Sarabun New" w:hAnsi="TH Sarabun New" w:cs="TH Sarabun New"/>
+          <w:color w:val="000000" w:themeColor="text1"/>
+          <w:sz w:val="32"/>
+          <w:szCs w:val="32"/>
+          <w:lang w:bidi="th-TH"/>
+        </w:rPr>
+        <w:t>applicant_name</w:t>
+      </w:r>
+      <w:proofErr w:type="spellEnd"/>
+      <w:r>
+        <w:rPr>
+          <w:rFonts w:ascii="TH Sarabun New" w:hAnsi="TH Sarabun New" w:cs="TH Sarabun New"/>
+          <w:color w:val="000000" w:themeColor="text1"/>
+          <w:sz w:val="32"/>
+          <w:szCs w:val="32"/>
+          <w:lang w:bidi="th-TH"/>
+        </w:rPr>
+        <w:t>}}</w:t>
+      </w:r>
+      <w:r>
+        <w:rPr>
+          <w:rFonts w:ascii="TH Sarabun New" w:hAnsi="TH Sarabun New" w:cs="TH Sarabun New"/>
+          <w:color w:val="000000" w:themeColor="text1"/>
+          <w:sz w:val="32"/>
+          <w:szCs w:val="32"/>
+        </w:rPr>
+        <w:t xml:space="preserve"> </w:t>
       </w:r>
       <w:r>
         <w:rPr>
@@ -1334,17 +1429,17 @@
     <w:lsdException w:name="Unresolved Mention" w:semiHidden="1" w:unhideWhenUsed="1"/>
     <w:lsdException w:name="Smart Link" w:semiHidden="1" w:unhideWhenUsed="1"/>
   </w:latentStyles>
-  <w:style w:type="paragraph" w:default="1" w:styleId="Normal">
+  <w:style w:type="paragraph" w:default="1" w:styleId="a">
     <w:name w:val="Normal"/>
     <w:qFormat/>
   </w:style>
-  <w:style w:type="character" w:default="1" w:styleId="DefaultParagraphFont">
+  <w:style w:type="character" w:default="1" w:styleId="a0">
     <w:name w:val="Default Paragraph Font"/>
     <w:uiPriority w:val="1"/>
     <w:semiHidden/>
     <w:unhideWhenUsed/>
   </w:style>
-  <w:style w:type="table" w:default="1" w:styleId="TableNormal">
+  <w:style w:type="table" w:default="1" w:styleId="a1">
     <w:name w:val="Normal Table"/>
     <w:uiPriority w:val="99"/>
     <w:semiHidden/>
@@ -1359,7 +1454,7 @@
       </w:tblCellMar>
     </w:tblPr>
   </w:style>
-  <w:style w:type="numbering" w:default="1" w:styleId="NoList">
+  <w:style w:type="numbering" w:default="1" w:styleId="a2">
     <w:name w:val="No List"/>
     <w:uiPriority w:val="99"/>
     <w:semiHidden/>

</xml_diff>